<commit_message>
fix: Update contract template to remove bold formatting from customer paragraph
- Remove bold formatting from paragraph containing customer name
- Only customer name placeholder should be bold per design requirements

🤖 Generated with [Claude Code](https://claude.com/claude-code)

Co-Authored-By: Claude <noreply@anthropic.com>
</commit_message>
<xml_diff>
--- a/backend/templates/FK COL - GM - Activos.docx
+++ b/backend/templates/FK COL - GM - Activos.docx
@@ -333,16 +333,12 @@
       </w:pPr>
       <w:r>
         <w:rPr>
-          <w:b/>
-          <w:bCs/>
           <w:lang w:val="es-CO"/>
         </w:rPr>
         <w:t>[</w:t>
       </w:r>
       <w:r>
         <w:rPr>
-          <w:b/>
-          <w:bCs/>
           <w:highlight w:val="yellow"/>
           <w:lang w:val="es-CO"/>
         </w:rPr>
@@ -350,17 +346,15 @@
       </w:r>
       <w:r>
         <w:rPr>
-          <w:b/>
-          <w:bCs/>
-          <w:lang w:val="es-CO"/>
-        </w:rPr>
-        <w:t>]</w:t>
-      </w:r>
-      <w:r>
-        <w:rPr>
-          <w:lang w:val="es-CO"/>
-        </w:rPr>
-        <w:t xml:space="preserve">, sociedad </w:t>
+          <w:lang w:val="es-CO"/>
+        </w:rPr>
+        <w:t>],</w:t>
+      </w:r>
+      <w:r>
+        <w:rPr>
+          <w:lang w:val="es-CO"/>
+        </w:rPr>
+        <w:t xml:space="preserve"> sociedad </w:t>
       </w:r>
       <w:r>
         <w:rPr>
@@ -11700,7 +11694,6 @@
         <w:pStyle w:val="Heading3"/>
       </w:pPr>
       <w:r>
-        <w:lastRenderedPageBreak/>
         <w:t xml:space="preserve">Todos estos derechos, poderes, facultades y recursos serán acumulables y el ejercicio o el inicio del ejercicio de uno no implicarán la renuncia de ninguno otro de dichos derechos. Ni la demora ni la omisión por parte de </w:t>
       </w:r>
       <w:r>
@@ -11909,11 +11902,7 @@
         <w:pStyle w:val="Heading3"/>
       </w:pPr>
       <w:r>
-        <w:t xml:space="preserve">Las restricciones contenidas en esta cláusula seguirán aplicándose durante un período de tres (3) años tras la terminación o expiración del presente Contrato, lo que ocurra </w:t>
-      </w:r>
-      <w:r>
-        <w:lastRenderedPageBreak/>
-        <w:t>primero. Las disposiciones de esta cláusula prevalecerán sobre cualquier acuerdo de confidencialidad previo entre las Partes en relación con el objeto del presente Contrato.</w:t>
+        <w:t>Las restricciones contenidas en esta cláusula seguirán aplicándose durante un período de tres (3) años tras la terminación o expiración del presente Contrato, lo que ocurra primero. Las disposiciones de esta cláusula prevalecerán sobre cualquier acuerdo de confidencialidad previo entre las Partes en relación con el objeto del presente Contrato.</w:t>
       </w:r>
     </w:p>
     <w:p>
@@ -12116,11 +12105,7 @@
         <w:t>Finkargo Colombia</w:t>
       </w:r>
       <w:r>
-        <w:t xml:space="preserve"> para que trate, transfiera o transmita los Datos Personales a terceros, como patrimonios autónomos, y/o beneficiarios de los mismos, incluyendo al Beneficiario, incluso a países que no cuenten con los niveles adecuados de protección, </w:t>
-      </w:r>
-      <w:r>
-        <w:lastRenderedPageBreak/>
-        <w:t xml:space="preserve">con las finalidades establecidas en la Política de </w:t>
+        <w:t xml:space="preserve"> para que trate, transfiera o transmita los Datos Personales a terceros, como patrimonios autónomos, y/o beneficiarios de los mismos, incluyendo al Beneficiario, incluso a países que no cuenten con los niveles adecuados de protección, con las finalidades establecidas en la Política de </w:t>
       </w:r>
       <w:r>
         <w:t>Privacidad</w:t>
@@ -12878,7 +12863,6 @@
         <w:pStyle w:val="Heading3"/>
       </w:pPr>
       <w:r>
-        <w:lastRenderedPageBreak/>
         <w:t xml:space="preserve">Todas las modificaciones, adiciones, aclaraciones y/o renuncias que se efectúen al presente Contrato, serán válidas cuando consten por escrito y estén debidamente firmadas por los </w:t>
       </w:r>
       <w:r>
@@ -13375,11 +13359,7 @@
         </w:rPr>
       </w:pPr>
       <w:r>
-        <w:t xml:space="preserve">. Forman parte integral del presente Contrato todos sus Anexos, </w:t>
-      </w:r>
-      <w:r>
-        <w:lastRenderedPageBreak/>
-        <w:t>incluyendo los que se incorporen con posterioridad a la firma del mismo.</w:t>
+        <w:t>. Forman parte integral del presente Contrato todos sus Anexos, incluyendo los que se incorporen con posterioridad a la firma del mismo.</w:t>
       </w:r>
     </w:p>
     <w:p>
@@ -13660,7 +13640,6 @@
         <w:rPr>
           <w:u w:val="none"/>
         </w:rPr>
-        <w:lastRenderedPageBreak/>
         <w:t>ANEXO A</w:t>
       </w:r>
       <w:r>
@@ -13771,7 +13750,6 @@
         <w:rPr>
           <w:u w:val="none"/>
         </w:rPr>
-        <w:lastRenderedPageBreak/>
         <w:t>ANEXO B</w:t>
       </w:r>
       <w:r>
@@ -13848,7 +13826,6 @@
         <w:rPr>
           <w:u w:val="none"/>
         </w:rPr>
-        <w:lastRenderedPageBreak/>
         <w:t>ANEXO C</w:t>
       </w:r>
       <w:r>
@@ -19148,28 +19125,28 @@
 </file>
 
 <file path=customXml/item1.xml><?xml version="1.0" encoding="utf-8"?>
-<b:Sources xmlns:b="http://schemas.openxmlformats.org/officeDocument/2006/bibliography" xmlns="http://schemas.openxmlformats.org/officeDocument/2006/bibliography" SelectedStyle="\APASixthEditionOfficeOnline.xsl" StyleName="APA" Version="6"/>
-</file>
-
-<file path=customXml/item2.xml><?xml version="1.0" encoding="utf-8"?>
 <go:gDocsCustomXmlDataStorage xmlns:go="http://customooxmlschemas.google.com/" xmlns:r="http://schemas.openxmlformats.org/officeDocument/2006/relationships">
   <go:docsCustomData xmlns:go="http://customooxmlschemas.google.com/" roundtripDataSignature="AMtx7mhzdpfn1finIqKXU+1UPIfU21OW1Q==">AMUW2mVvpZPnv5te96KCzqdpwIhLXEqqDf1Jm/Jsn5xfICjpf7+cLx66Pg3Z6OyclqamRuaI6NzxVfznks8qzXgq6Shzb3AvxFhRa3ikUeQpf55ToVd72oiAa63NjuOKhuLrTUBAwX7TxT6/jKPCkAwx81Cl/siheji2glXXaNE6LOUNE4D+R7OYEQfFjaKo2CzTlnGc1WEdiQoLVoiQnpq1QlduKazjn1jsN2tZpEvoXRVNcjxJejMHEr/s7YsU4SRSZf/CGJlMizcgpazttZ88EnKSbtK2kaxsLvT+ygQ6Nt698VUDGYk4KHB27iDAg6aqb4m7SIwK</go:docsCustomData>
 </go:gDocsCustomXmlDataStorage>
 </file>
 
-<file path=customXml/itemProps1.xml><?xml version="1.0" encoding="utf-8"?>
-<ds:datastoreItem xmlns:ds="http://schemas.openxmlformats.org/officeDocument/2006/customXml" ds:itemID="{373DA788-535C-4842-9536-B8D15A43118A}">
-  <ds:schemaRefs>
-    <ds:schemaRef ds:uri="http://schemas.openxmlformats.org/officeDocument/2006/bibliography"/>
-  </ds:schemaRefs>
-</ds:datastoreItem>
+<file path=customXml/item2.xml><?xml version="1.0" encoding="utf-8"?>
+<b:Sources xmlns:b="http://schemas.openxmlformats.org/officeDocument/2006/bibliography" xmlns="http://schemas.openxmlformats.org/officeDocument/2006/bibliography" SelectedStyle="\APASixthEditionOfficeOnline.xsl" StyleName="APA" Version="6"/>
 </file>
 
-<file path=customXml/itemProps2.xml><?xml version="1.0" encoding="utf-8"?>
+<file path=customXml/itemProps1.xml><?xml version="1.0" encoding="utf-8"?>
 <ds:datastoreItem xmlns:ds="http://schemas.openxmlformats.org/officeDocument/2006/customXml" ds:itemID="{11111111-1234-1234-1234-123412341234}">
   <ds:schemaRefs>
     <ds:schemaRef ds:uri="http://customooxmlschemas.google.com/"/>
     <ds:schemaRef ds:uri="http://schemas.openxmlformats.org/officeDocument/2006/relationships"/>
   </ds:schemaRefs>
 </ds:datastoreItem>
+</file>
+
+<file path=customXml/itemProps2.xml><?xml version="1.0" encoding="utf-8"?>
+<ds:datastoreItem xmlns:ds="http://schemas.openxmlformats.org/officeDocument/2006/customXml" ds:itemID="{373DA788-535C-4842-9536-B8D15A43118A}">
+  <ds:schemaRefs>
+    <ds:schemaRef ds:uri="http://schemas.openxmlformats.org/officeDocument/2006/bibliography"/>
+  </ds:schemaRefs>
+</ds:datastoreItem>
 </file>
</xml_diff>

<commit_message>
chore: Update contract template with latest changes
🤖 Generated with [Claude Code](https://claude.com/claude-code)

Co-Authored-By: Claude <noreply@anthropic.com>
</commit_message>
<xml_diff>
--- a/backend/templates/FK COL - GM - Activos.docx
+++ b/backend/templates/FK COL - GM - Activos.docx
@@ -228,14 +228,14 @@
       </w:pPr>
       <w:r>
         <w:rPr>
-          <w:b/>
+          <w:bCs/>
           <w:lang w:val="es-CO"/>
         </w:rPr>
         <w:t>FINKARGO COLOMBIA</w:t>
       </w:r>
       <w:r>
         <w:rPr>
-          <w:b/>
+          <w:bCs/>
           <w:lang w:val="es-CO"/>
         </w:rPr>
         <w:t xml:space="preserve"> S.A.S.</w:t>
@@ -280,7 +280,21 @@
         <w:rPr>
           <w:lang w:val="es-CO"/>
         </w:rPr>
-        <w:t xml:space="preserve"> en la ciudad de Bogotá D.C., identificada con NIT 901.456.364–1, y representada para todos los efectos de este Contrato por John Elvis Jiménez Jiménez, ide</w:t>
+        <w:t xml:space="preserve"> en la ciudad de Bogotá D.C., identificada con NIT 901.456.364–1, y representada para todos los efectos de este Contrato por John Elvis Jiménez </w:t>
+      </w:r>
+      <w:proofErr w:type="spellStart"/>
+      <w:r>
+        <w:rPr>
+          <w:lang w:val="es-CO"/>
+        </w:rPr>
+        <w:t>Jiménez</w:t>
+      </w:r>
+      <w:proofErr w:type="spellEnd"/>
+      <w:r>
+        <w:rPr>
+          <w:lang w:val="es-CO"/>
+        </w:rPr>
+        <w:t>, ide</w:t>
       </w:r>
       <w:r>
         <w:rPr>
@@ -290,6 +304,7 @@
         </w:rPr>
         <w:t>ntificado como aparece al pie de su firma (“</w:t>
       </w:r>
+      <w:proofErr w:type="spellStart"/>
       <w:r>
         <w:rPr>
           <w:rFonts w:cs="Open Sans"/>
@@ -297,7 +312,17 @@
           <w:u w:val="single"/>
           <w:lang w:val="es-CO"/>
         </w:rPr>
-        <w:t>Finkargo Colombia</w:t>
+        <w:t>Finkargo</w:t>
+      </w:r>
+      <w:proofErr w:type="spellEnd"/>
+      <w:r>
+        <w:rPr>
+          <w:rFonts w:cs="Open Sans"/>
+          <w:szCs w:val="20"/>
+          <w:u w:val="single"/>
+          <w:lang w:val="es-CO"/>
+        </w:rPr>
+        <w:t xml:space="preserve"> Colombia</w:t>
       </w:r>
       <w:r>
         <w:rPr>
@@ -488,16 +513,24 @@
         </w:rPr>
       </w:pPr>
       <w:bookmarkStart w:id="4" w:name="_Hlk94191370"/>
+      <w:proofErr w:type="spellStart"/>
       <w:r>
         <w:rPr>
           <w:lang w:val="es-ES_tradnl"/>
         </w:rPr>
-        <w:t>Finkargo Colombia</w:t>
-      </w:r>
+        <w:t>Finkargo</w:t>
+      </w:r>
+      <w:proofErr w:type="spellEnd"/>
       <w:r>
         <w:rPr>
           <w:lang w:val="es-ES_tradnl"/>
         </w:rPr>
+        <w:t xml:space="preserve"> Colombia</w:t>
+      </w:r>
+      <w:r>
+        <w:rPr>
+          <w:lang w:val="es-ES_tradnl"/>
+        </w:rPr>
         <w:t xml:space="preserve"> y el Importador</w:t>
       </w:r>
       <w:r>
@@ -888,11 +921,19 @@
         </w:rPr>
         <w:t xml:space="preserve">QUE, </w:t>
       </w:r>
-      <w:r>
-        <w:rPr>
-          <w:lang w:val="es-CO"/>
-        </w:rPr>
-        <w:t>Finkargo Colombia</w:t>
+      <w:proofErr w:type="spellStart"/>
+      <w:r>
+        <w:rPr>
+          <w:lang w:val="es-CO"/>
+        </w:rPr>
+        <w:t>Finkargo</w:t>
+      </w:r>
+      <w:proofErr w:type="spellEnd"/>
+      <w:r>
+        <w:rPr>
+          <w:lang w:val="es-CO"/>
+        </w:rPr>
+        <w:t xml:space="preserve"> Colombia</w:t>
       </w:r>
       <w:r>
         <w:rPr>
@@ -1125,7 +1166,21 @@
         <w:rPr>
           <w:lang w:val="es-CO"/>
         </w:rPr>
-        <w:t>(según el mismo sea re-expresado, suplementado, adicionado o de cualquier otra forma modificado) en virtud del cual</w:t>
+        <w:t xml:space="preserve">(según el mismo sea </w:t>
+      </w:r>
+      <w:proofErr w:type="spellStart"/>
+      <w:r>
+        <w:rPr>
+          <w:lang w:val="es-CO"/>
+        </w:rPr>
+        <w:t>re-expresado</w:t>
+      </w:r>
+      <w:proofErr w:type="spellEnd"/>
+      <w:r>
+        <w:rPr>
+          <w:lang w:val="es-CO"/>
+        </w:rPr>
+        <w:t>, suplementado, adicionado o de cualquier otra forma modificado) en virtud del cual</w:t>
       </w:r>
       <w:r>
         <w:rPr>
@@ -1162,7 +1217,21 @@
         <w:rPr>
           <w:lang w:val="es-CO"/>
         </w:rPr>
-        <w:t>a Finkargo Colombia</w:t>
+        <w:t xml:space="preserve">a </w:t>
+      </w:r>
+      <w:proofErr w:type="spellStart"/>
+      <w:r>
+        <w:rPr>
+          <w:lang w:val="es-CO"/>
+        </w:rPr>
+        <w:t>Finkargo</w:t>
+      </w:r>
+      <w:proofErr w:type="spellEnd"/>
+      <w:r>
+        <w:rPr>
+          <w:lang w:val="es-CO"/>
+        </w:rPr>
+        <w:t xml:space="preserve"> Colombia</w:t>
       </w:r>
       <w:r>
         <w:rPr>
@@ -1176,11 +1245,19 @@
         </w:rPr>
         <w:t xml:space="preserve"> y </w:t>
       </w:r>
-      <w:r>
-        <w:rPr>
-          <w:lang w:val="es-CO"/>
-        </w:rPr>
-        <w:t>Finkargo Colombia</w:t>
+      <w:proofErr w:type="spellStart"/>
+      <w:r>
+        <w:rPr>
+          <w:lang w:val="es-CO"/>
+        </w:rPr>
+        <w:t>Finkargo</w:t>
+      </w:r>
+      <w:proofErr w:type="spellEnd"/>
+      <w:r>
+        <w:rPr>
+          <w:lang w:val="es-CO"/>
+        </w:rPr>
+        <w:t xml:space="preserve"> Colombia</w:t>
       </w:r>
       <w:r>
         <w:rPr>
@@ -1240,11 +1317,19 @@
         </w:rPr>
         <w:t xml:space="preserve">QUE, con el fin de garantizar las Obligaciones Garantizadas adquiridas de tiempo en tiempo por el Importador en virtud del Contrato Marco, el Importador se comprometió a otorgar a favor y en beneficio de </w:t>
       </w:r>
-      <w:r>
-        <w:rPr>
-          <w:lang w:val="es-CO"/>
-        </w:rPr>
-        <w:t>Finkargo Colombia</w:t>
+      <w:proofErr w:type="spellStart"/>
+      <w:r>
+        <w:rPr>
+          <w:lang w:val="es-CO"/>
+        </w:rPr>
+        <w:t>Finkargo</w:t>
+      </w:r>
+      <w:proofErr w:type="spellEnd"/>
+      <w:r>
+        <w:rPr>
+          <w:lang w:val="es-CO"/>
+        </w:rPr>
+        <w:t xml:space="preserve"> Colombia</w:t>
       </w:r>
       <w:r>
         <w:rPr>
@@ -1331,11 +1416,19 @@
         </w:rPr>
         <w:t xml:space="preserve"> las Obligaciones Garantizadas del Importador con </w:t>
       </w:r>
-      <w:r>
-        <w:rPr>
-          <w:lang w:val="es-CO"/>
-        </w:rPr>
-        <w:t>Finkargo Colombia</w:t>
+      <w:proofErr w:type="spellStart"/>
+      <w:r>
+        <w:rPr>
+          <w:lang w:val="es-CO"/>
+        </w:rPr>
+        <w:t>Finkargo</w:t>
+      </w:r>
+      <w:proofErr w:type="spellEnd"/>
+      <w:r>
+        <w:rPr>
+          <w:lang w:val="es-CO"/>
+        </w:rPr>
+        <w:t xml:space="preserve"> Colombia</w:t>
       </w:r>
       <w:r>
         <w:rPr>
@@ -1393,11 +1486,19 @@
         </w:rPr>
         <w:t xml:space="preserve"> por el Importador a </w:t>
       </w:r>
-      <w:r>
-        <w:rPr>
-          <w:lang w:val="es-CO"/>
-        </w:rPr>
-        <w:t>Finkargo Colombia</w:t>
+      <w:proofErr w:type="spellStart"/>
+      <w:r>
+        <w:rPr>
+          <w:lang w:val="es-CO"/>
+        </w:rPr>
+        <w:t>Finkargo</w:t>
+      </w:r>
+      <w:proofErr w:type="spellEnd"/>
+      <w:r>
+        <w:rPr>
+          <w:lang w:val="es-CO"/>
+        </w:rPr>
+        <w:t xml:space="preserve"> Colombia</w:t>
       </w:r>
       <w:r>
         <w:rPr>
@@ -1479,7 +1580,11 @@
       <w:bookmarkStart w:id="9" w:name="_heading=h.30j0zll" w:colFirst="0" w:colLast="0"/>
       <w:bookmarkEnd w:id="9"/>
       <w:r>
-        <w:t xml:space="preserve">Sección 1.01  </w:t>
+        <w:t xml:space="preserve">Sección </w:t>
+      </w:r>
+      <w:proofErr w:type="gramStart"/>
+      <w:r>
+        <w:t xml:space="preserve">1.01  </w:t>
       </w:r>
       <w:r>
         <w:rPr>
@@ -1488,6 +1593,7 @@
         </w:rPr>
         <w:t>Interpretación</w:t>
       </w:r>
+      <w:proofErr w:type="gramEnd"/>
     </w:p>
     <w:p>
       <w:pPr>
@@ -1644,12 +1750,17 @@
         <w:t xml:space="preserve"> Contrato</w:t>
       </w:r>
       <w:r>
-        <w:t xml:space="preserve"> y sus Anexos antes de su suscripción y antes de obligarse en los términos del </w:t>
+        <w:t xml:space="preserve"> y sus Anexos antes de su suscripción y antes de obligarse en los términos </w:t>
+      </w:r>
+      <w:proofErr w:type="gramStart"/>
+      <w:r>
+        <w:t xml:space="preserve">del </w:t>
       </w:r>
       <w:r>
         <w:t>mismo</w:t>
       </w:r>
       <w:bookmarkEnd w:id="11"/>
+      <w:proofErr w:type="gramEnd"/>
       <w:r>
         <w:t xml:space="preserve">. En caso de </w:t>
       </w:r>
@@ -1916,11 +2027,19 @@
       <w:r>
         <w:t>“</w:t>
       </w:r>
-      <w:r>
-        <w:rPr>
-          <w:u w:val="single"/>
-        </w:rPr>
-        <w:t>Avaluador Independiente</w:t>
+      <w:proofErr w:type="spellStart"/>
+      <w:r>
+        <w:rPr>
+          <w:u w:val="single"/>
+        </w:rPr>
+        <w:t>Avaluador</w:t>
+      </w:r>
+      <w:proofErr w:type="spellEnd"/>
+      <w:r>
+        <w:rPr>
+          <w:u w:val="single"/>
+        </w:rPr>
+        <w:t xml:space="preserve"> Independiente</w:t>
       </w:r>
       <w:r>
         <w:t>” significa una Persona que (a) cumple con los Criterios de Independencia y Experiencia; (b) tenga domicilio principal o una oficina de representación en Colombia; y (c) cuyo objeto social consista en la realización de actividades de valoración de activos y empresas.</w:t>
@@ -1978,12 +2097,21 @@
         </w:rPr>
         <w:t xml:space="preserve"> FC – </w:t>
       </w:r>
+      <w:proofErr w:type="spellStart"/>
       <w:r>
         <w:rPr>
           <w:rFonts w:eastAsia="Times New Roman" w:cs="Times New Roman"/>
           <w:lang w:val="es-CO"/>
         </w:rPr>
-        <w:t>Finkargo Colombia</w:t>
+        <w:t>Finkargo</w:t>
+      </w:r>
+      <w:proofErr w:type="spellEnd"/>
+      <w:r>
+        <w:rPr>
+          <w:rFonts w:eastAsia="Times New Roman" w:cs="Times New Roman"/>
+          <w:lang w:val="es-CO"/>
+        </w:rPr>
+        <w:t xml:space="preserve"> Colombia</w:t>
       </w:r>
       <w:r>
         <w:rPr>
@@ -2182,12 +2310,53 @@
         </w:rPr>
         <w:t xml:space="preserve">” significa </w:t>
       </w:r>
+      <w:proofErr w:type="spellStart"/>
       <w:r>
         <w:rPr>
           <w:i/>
           <w:lang w:val="es-CO"/>
         </w:rPr>
-        <w:t>bill of lading,</w:t>
+        <w:t>bill</w:t>
+      </w:r>
+      <w:proofErr w:type="spellEnd"/>
+      <w:r>
+        <w:rPr>
+          <w:i/>
+          <w:lang w:val="es-CO"/>
+        </w:rPr>
+        <w:t xml:space="preserve"> </w:t>
+      </w:r>
+      <w:proofErr w:type="spellStart"/>
+      <w:r>
+        <w:rPr>
+          <w:i/>
+          <w:lang w:val="es-CO"/>
+        </w:rPr>
+        <w:t>of</w:t>
+      </w:r>
+      <w:proofErr w:type="spellEnd"/>
+      <w:r>
+        <w:rPr>
+          <w:i/>
+          <w:lang w:val="es-CO"/>
+        </w:rPr>
+        <w:t xml:space="preserve"> </w:t>
+      </w:r>
+      <w:proofErr w:type="spellStart"/>
+      <w:r>
+        <w:rPr>
+          <w:i/>
+          <w:lang w:val="es-CO"/>
+        </w:rPr>
+        <w:t>lading</w:t>
+      </w:r>
+      <w:proofErr w:type="spellEnd"/>
+      <w:r>
+        <w:rPr>
+          <w:i/>
+          <w:lang w:val="es-CO"/>
+        </w:rPr>
+        <w:t>,</w:t>
       </w:r>
       <w:r>
         <w:rPr>
@@ -2200,8 +2369,17 @@
           <w:i/>
           <w:lang w:val="es-CO"/>
         </w:rPr>
-        <w:t>air bill</w:t>
-      </w:r>
+        <w:t xml:space="preserve">air </w:t>
+      </w:r>
+      <w:proofErr w:type="spellStart"/>
+      <w:r>
+        <w:rPr>
+          <w:i/>
+          <w:lang w:val="es-CO"/>
+        </w:rPr>
+        <w:t>bill</w:t>
+      </w:r>
+      <w:proofErr w:type="spellEnd"/>
       <w:r>
         <w:rPr>
           <w:lang w:val="es-CO"/>
@@ -2738,12 +2916,14 @@
       <w:r>
         <w:t xml:space="preserve">” significa la venta, transferencia, cesión, arrendamiento o cualquier otra disposición (incluyendo operaciones de </w:t>
       </w:r>
+      <w:proofErr w:type="spellStart"/>
       <w:r>
         <w:rPr>
           <w:i/>
         </w:rPr>
         <w:t>leaseback</w:t>
       </w:r>
+      <w:proofErr w:type="spellEnd"/>
       <w:r>
         <w:t xml:space="preserve">), de la propiedad de cualquier Persona, incluyendo la venta, cesión, transferencia o cualquier otra </w:t>
       </w:r>
@@ -2936,7 +3116,21 @@
         <w:rPr>
           <w:lang w:val="es-CO"/>
         </w:rPr>
-        <w:t xml:space="preserve"> o acto que genere o razonablemente pueda generar una alteración o efecto importante y perjudicial sobre, (a) los negocios, activos, operaciones o situación financiera del Importador; (b) la capacidad financiera, legal u operativa del Proveedor de cumplir con su obligación de entregar un Instrumento de Pago que sea adquirido por Finkargo; (c) la Mercancía o su Importación; (d) la capacidad del Importador para cumplir cualquiera de sus obligaciones bajo el Contrato; </w:t>
+        <w:t xml:space="preserve"> o acto que genere o razonablemente pueda generar una alteración o efecto importante y perjudicial sobre, (a) los negocios, activos, operaciones o situación financiera del Importador; (b) la capacidad financiera, legal u operativa del Proveedor de cumplir con su obligación de entregar un Instrumento de Pago que sea adquirido por </w:t>
+      </w:r>
+      <w:proofErr w:type="spellStart"/>
+      <w:r>
+        <w:rPr>
+          <w:lang w:val="es-CO"/>
+        </w:rPr>
+        <w:t>Finkargo</w:t>
+      </w:r>
+      <w:proofErr w:type="spellEnd"/>
+      <w:r>
+        <w:rPr>
+          <w:lang w:val="es-CO"/>
+        </w:rPr>
+        <w:t xml:space="preserve">; (c) la Mercancía o su Importación; (d) la capacidad del Importador para cumplir cualquiera de sus obligaciones bajo el Contrato; </w:t>
       </w:r>
       <w:r>
         <w:rPr>
@@ -2960,7 +3154,21 @@
         <w:rPr>
           <w:lang w:val="es-CO"/>
         </w:rPr>
-        <w:t xml:space="preserve">; y/o (f) los derechos y acciones de Finkargo bajo </w:t>
+        <w:t xml:space="preserve">; y/o (f) los derechos y acciones de </w:t>
+      </w:r>
+      <w:proofErr w:type="spellStart"/>
+      <w:r>
+        <w:rPr>
+          <w:lang w:val="es-CO"/>
+        </w:rPr>
+        <w:t>Finkargo</w:t>
+      </w:r>
+      <w:proofErr w:type="spellEnd"/>
+      <w:r>
+        <w:rPr>
+          <w:lang w:val="es-CO"/>
+        </w:rPr>
+        <w:t xml:space="preserve"> bajo </w:t>
       </w:r>
       <w:r>
         <w:rPr>
@@ -3061,8 +3269,16 @@
         <w:rPr>
           <w:u w:val="single"/>
         </w:rPr>
-        <w:t>Finkargo Abroad</w:t>
-      </w:r>
+        <w:t xml:space="preserve">Finkargo </w:t>
+      </w:r>
+      <w:proofErr w:type="spellStart"/>
+      <w:r>
+        <w:rPr>
+          <w:u w:val="single"/>
+        </w:rPr>
+        <w:t>Abroad</w:t>
+      </w:r>
+      <w:proofErr w:type="spellEnd"/>
       <w:r>
         <w:t xml:space="preserve">” significa cualquier Afiliada </w:t>
       </w:r>
@@ -3086,12 +3302,21 @@
         </w:rPr>
         <w:t>“</w:t>
       </w:r>
-      <w:r>
-        <w:rPr>
-          <w:u w:val="single"/>
-          <w:lang w:val="es-CO"/>
-        </w:rPr>
-        <w:t>Finkargo Colombia</w:t>
+      <w:proofErr w:type="spellStart"/>
+      <w:r>
+        <w:rPr>
+          <w:u w:val="single"/>
+          <w:lang w:val="es-CO"/>
+        </w:rPr>
+        <w:t>Finkargo</w:t>
+      </w:r>
+      <w:proofErr w:type="spellEnd"/>
+      <w:r>
+        <w:rPr>
+          <w:u w:val="single"/>
+          <w:lang w:val="es-CO"/>
+        </w:rPr>
+        <w:t xml:space="preserve"> Colombia</w:t>
       </w:r>
       <w:r>
         <w:rPr>
@@ -3491,12 +3716,14 @@
         </w:rPr>
         <w:t xml:space="preserve"> (</w:t>
       </w:r>
+      <w:proofErr w:type="spellStart"/>
       <w:r>
         <w:rPr>
           <w:lang w:val="es-CO"/>
         </w:rPr>
         <w:t>ii</w:t>
       </w:r>
+      <w:proofErr w:type="spellEnd"/>
       <w:r>
         <w:rPr>
           <w:lang w:val="es-CO"/>
@@ -3515,12 +3742,14 @@
         </w:rPr>
         <w:t xml:space="preserve"> y (</w:t>
       </w:r>
+      <w:proofErr w:type="spellStart"/>
       <w:r>
         <w:rPr>
           <w:lang w:val="es-CO"/>
         </w:rPr>
         <w:t>iii</w:t>
       </w:r>
+      <w:proofErr w:type="spellEnd"/>
       <w:r>
         <w:rPr>
           <w:lang w:val="es-CO"/>
@@ -3991,11 +4220,19 @@
         </w:rPr>
         <w:t xml:space="preserve">” significa la comunicación enviada por </w:t>
       </w:r>
-      <w:r>
-        <w:rPr>
-          <w:lang w:val="es-CO"/>
-        </w:rPr>
-        <w:t>Finkargo Colombia</w:t>
+      <w:proofErr w:type="spellStart"/>
+      <w:r>
+        <w:rPr>
+          <w:lang w:val="es-CO"/>
+        </w:rPr>
+        <w:t>Finkargo</w:t>
+      </w:r>
+      <w:proofErr w:type="spellEnd"/>
+      <w:r>
+        <w:rPr>
+          <w:lang w:val="es-CO"/>
+        </w:rPr>
+        <w:t xml:space="preserve"> Colombia</w:t>
       </w:r>
       <w:r>
         <w:rPr>
@@ -4137,11 +4374,19 @@
         </w:rPr>
         <w:t xml:space="preserve">) </w:t>
       </w:r>
-      <w:r>
-        <w:rPr>
-          <w:lang w:val="es-CO"/>
-        </w:rPr>
-        <w:t>Finkargo Colombia</w:t>
+      <w:proofErr w:type="spellStart"/>
+      <w:r>
+        <w:rPr>
+          <w:lang w:val="es-CO"/>
+        </w:rPr>
+        <w:t>Finkargo</w:t>
+      </w:r>
+      <w:proofErr w:type="spellEnd"/>
+      <w:r>
+        <w:rPr>
+          <w:lang w:val="es-CO"/>
+        </w:rPr>
+        <w:t xml:space="preserve"> Colombia</w:t>
       </w:r>
       <w:r>
         <w:rPr>
@@ -4737,7 +4982,23 @@
           <w:u w:val="single"/>
           <w:lang w:val="es-CO"/>
         </w:rPr>
-        <w:t>Sección 8.05(b)(iii)(1)</w:t>
+        <w:t>Sección 8.05(b)(</w:t>
+      </w:r>
+      <w:proofErr w:type="spellStart"/>
+      <w:r>
+        <w:rPr>
+          <w:u w:val="single"/>
+          <w:lang w:val="es-CO"/>
+        </w:rPr>
+        <w:t>iii</w:t>
+      </w:r>
+      <w:proofErr w:type="spellEnd"/>
+      <w:r>
+        <w:rPr>
+          <w:u w:val="single"/>
+          <w:lang w:val="es-CO"/>
+        </w:rPr>
+        <w:t>)(1)</w:t>
       </w:r>
       <w:r>
         <w:rPr>
@@ -4947,7 +5208,15 @@
         <w:t>.</w:t>
       </w:r>
       <w:r>
-        <w:t xml:space="preserve"> Para efectos de este Contrato, se entiende que el Proveedor podrá ser Finkargo Abroad.</w:t>
+        <w:t xml:space="preserve"> Para efectos de este Contrato, se entiende que el Proveedor podrá ser Finkargo </w:t>
+      </w:r>
+      <w:proofErr w:type="spellStart"/>
+      <w:r>
+        <w:t>Abroad</w:t>
+      </w:r>
+      <w:proofErr w:type="spellEnd"/>
+      <w:r>
+        <w:t>.</w:t>
       </w:r>
     </w:p>
     <w:p>
@@ -6273,17 +6542,39 @@
               </w:rPr>
               <w:t xml:space="preserve">Significa, sin duplicación, todas las obligaciones que contraiga o llegare a contraer el Importador en favor de </w:t>
             </w:r>
+            <w:proofErr w:type="spellStart"/>
             <w:r>
               <w:rPr>
                 <w:lang w:val="es-ES_tradnl"/>
               </w:rPr>
-              <w:t>Finkargo Colombia</w:t>
-            </w:r>
+              <w:t>Finkargo</w:t>
+            </w:r>
+            <w:proofErr w:type="spellEnd"/>
             <w:r>
               <w:rPr>
                 <w:lang w:val="es-ES_tradnl"/>
               </w:rPr>
-              <w:t xml:space="preserve"> en virtud del Contrato Marco, incluyendo pero sin limitarse al pago de todas las sumas por concepto de comisiones, capital, cualquier clase de intereses, honorarios, otros costos y gastos, gastos de cobranza judicial y extrajudicial, obligaciones de indemnización y cualesquiera otras obligaciones (según las mismas sean adicionadas, re-expresadas, completadas o de cualquier otra forma modificadas) actuales o que en el futuro llegaren a generarse a cargo del Importador en virtud del Contrato Marco, estén o no respaldados por títulos valores o hubieren sido contraídas a través de cualquier acto o instrumento, en su vencimiento, ya sea según vencimiento expreso, mediante el pago anticipado requerido, declaración, aceleración, exigencia o de cualquier otro modo (conjuntamente, las “</w:t>
+              <w:t xml:space="preserve"> Colombia</w:t>
+            </w:r>
+            <w:r>
+              <w:rPr>
+                <w:lang w:val="es-ES_tradnl"/>
+              </w:rPr>
+              <w:t xml:space="preserve"> en virtud del Contrato Marco, incluyendo pero sin limitarse al pago de todas las sumas por concepto de comisiones, capital, cualquier clase de intereses, honorarios, otros costos y gastos, gastos de cobranza judicial y extrajudicial, obligaciones de indemnización y cualesquiera otras obligaciones (según las mismas sean adicionadas, </w:t>
+            </w:r>
+            <w:proofErr w:type="spellStart"/>
+            <w:r>
+              <w:rPr>
+                <w:lang w:val="es-ES_tradnl"/>
+              </w:rPr>
+              <w:t>re-expresadas</w:t>
+            </w:r>
+            <w:proofErr w:type="spellEnd"/>
+            <w:r>
+              <w:rPr>
+                <w:lang w:val="es-ES_tradnl"/>
+              </w:rPr>
+              <w:t>, completadas o de cualquier otra forma modificadas) actuales o que en el futuro llegaren a generarse a cargo del Importador en virtud del Contrato Marco, estén o no respaldados por títulos valores o hubieren sido contraídas a través de cualquier acto o instrumento, en su vencimiento, ya sea según vencimiento expreso, mediante el pago anticipado requerido, declaración, aceleración, exigencia o de cualquier otro modo (conjuntamente, las “</w:t>
             </w:r>
             <w:r>
               <w:rPr>
@@ -6511,23 +6802,39 @@
               <w:lastRenderedPageBreak/>
               <w:t xml:space="preserve">registrada en el Registro de Garantías Mobiliarias, prorrogables por períodos adicionales de tres (3) años. Para efectos de claridad, la Garantía constituida mediante el presente contrato se mantendrá vigente (y su inscripción ante el Registro de Garantías Mobiliarias se prorrogará por parte de </w:t>
             </w:r>
+            <w:proofErr w:type="spellStart"/>
             <w:r>
               <w:rPr>
                 <w:lang w:val="es-ES_tradnl"/>
               </w:rPr>
-              <w:t>Finkargo Colombia</w:t>
-            </w:r>
+              <w:t>Finkargo</w:t>
+            </w:r>
+            <w:proofErr w:type="spellEnd"/>
             <w:r>
               <w:rPr>
                 <w:lang w:val="es-ES_tradnl"/>
               </w:rPr>
+              <w:t xml:space="preserve"> Colombia</w:t>
+            </w:r>
+            <w:r>
+              <w:rPr>
+                <w:lang w:val="es-ES_tradnl"/>
+              </w:rPr>
               <w:t xml:space="preserve"> cuantas veces sea necesario en los términos descritos arriba) hasta la ocurrencia del pago total de las Obligaciones Garantizadas a satisfacción de </w:t>
             </w:r>
+            <w:proofErr w:type="spellStart"/>
             <w:r>
               <w:rPr>
                 <w:lang w:val="es-ES_tradnl"/>
               </w:rPr>
-              <w:t>Finkargo Colombia</w:t>
+              <w:t>Finkargo</w:t>
+            </w:r>
+            <w:proofErr w:type="spellEnd"/>
+            <w:r>
+              <w:rPr>
+                <w:lang w:val="es-ES_tradnl"/>
+              </w:rPr>
+              <w:t xml:space="preserve"> Colombia</w:t>
             </w:r>
             <w:r>
               <w:rPr>
@@ -6850,8 +7157,13 @@
       <w:r>
         <w:t xml:space="preserve">ejercicio de los derechos o el cumplimiento de las obligaciones previstas en el Contrato Marco (salvo que como consecuencia de dicho ejercicio o cumplimiento se extingan todas las Obligaciones Garantizadas), o la sustitución de la Garantía en favor de </w:t>
       </w:r>
-      <w:r>
-        <w:t>Finkargo Colombia</w:t>
+      <w:proofErr w:type="spellStart"/>
+      <w:r>
+        <w:t>Finkargo</w:t>
+      </w:r>
+      <w:proofErr w:type="spellEnd"/>
+      <w:r>
+        <w:t xml:space="preserve"> Colombia</w:t>
       </w:r>
       <w:r>
         <w:t xml:space="preserve"> o en favor de cualquier otra Persona</w:t>
@@ -7028,9 +7340,11 @@
       <w:r>
         <w:t>) tener posesión sobre los Bienes en Garantía; (</w:t>
       </w:r>
+      <w:proofErr w:type="spellStart"/>
       <w:r>
         <w:t>ii</w:t>
       </w:r>
+      <w:proofErr w:type="spellEnd"/>
       <w:r>
         <w:t xml:space="preserve">) utilizar, operar y disponer de los activos que conforman los Bienes en Garantía en el curso ordinario de sus negocios; </w:t>
       </w:r>
@@ -7040,9 +7354,11 @@
       <w:r>
         <w:t>(</w:t>
       </w:r>
+      <w:proofErr w:type="spellStart"/>
       <w:r>
         <w:t>iii</w:t>
       </w:r>
+      <w:proofErr w:type="spellEnd"/>
       <w:r>
         <w:t>) realizar y finalizar todas las acciones necesarias para mantener los Bienes en Garantía en buenas condiciones de funcionamiento y de servicio, exceptuando el deterioro normal por el uso de los Bienes en Garantía.</w:t>
       </w:r>
@@ -7152,8 +7468,13 @@
       <w:r>
         <w:t xml:space="preserve">actualizado de tiempo en tiempo, cada vez que el Importador envíe a </w:t>
       </w:r>
-      <w:r>
-        <w:t>Finkargo Colombia</w:t>
+      <w:proofErr w:type="spellStart"/>
+      <w:r>
+        <w:t>Finkargo</w:t>
+      </w:r>
+      <w:proofErr w:type="spellEnd"/>
+      <w:r>
+        <w:t xml:space="preserve"> Colombia</w:t>
       </w:r>
       <w:r>
         <w:t xml:space="preserve"> un nuevo </w:t>
@@ -7173,8 +7494,13 @@
       <w:r>
         <w:t xml:space="preserve">, en cuyo caso </w:t>
       </w:r>
-      <w:r>
-        <w:t>Finkargo Colombia</w:t>
+      <w:proofErr w:type="spellStart"/>
+      <w:r>
+        <w:t>Finkargo</w:t>
+      </w:r>
+      <w:proofErr w:type="spellEnd"/>
+      <w:r>
+        <w:t xml:space="preserve"> Colombia</w:t>
       </w:r>
       <w:r>
         <w:t xml:space="preserve"> deberá realizar la actualización de dicho </w:t>
@@ -7233,8 +7559,13 @@
       <w:r>
         <w:t xml:space="preserve"> y a no trasladarlos a otro sitio distinto sin la previa notificación por escrito y aceptación de </w:t>
       </w:r>
-      <w:r>
-        <w:t>Finkargo Colombia</w:t>
+      <w:proofErr w:type="spellStart"/>
+      <w:r>
+        <w:t>Finkargo</w:t>
+      </w:r>
+      <w:proofErr w:type="spellEnd"/>
+      <w:r>
+        <w:t xml:space="preserve"> Colombia</w:t>
       </w:r>
       <w:r>
         <w:t>.</w:t>
@@ -7251,8 +7582,13 @@
       <w:r>
         <w:t xml:space="preserve">Sin perjuicio de lo anterior, no se requerirá autorización de </w:t>
       </w:r>
-      <w:r>
-        <w:t>Finkargo Colombia</w:t>
+      <w:proofErr w:type="spellStart"/>
+      <w:r>
+        <w:t>Finkargo</w:t>
+      </w:r>
+      <w:proofErr w:type="spellEnd"/>
+      <w:r>
+        <w:t xml:space="preserve"> Colombia</w:t>
       </w:r>
       <w:r>
         <w:t>, pero sí notificación previa, siempre que sea razonablemente posible,</w:t>
@@ -7266,21 +7602,27 @@
       <w:r>
         <w:t>) para el traslado de los Bienes en Garantía en los casos de fuerza mayor o caso fortuito, en los cuales la movilización de los Bienes en Garantía sea necesaria para mantener la integridad de los mismos; (</w:t>
       </w:r>
+      <w:proofErr w:type="spellStart"/>
       <w:r>
         <w:t>ii</w:t>
       </w:r>
+      <w:proofErr w:type="spellEnd"/>
       <w:r>
         <w:t>) en relación con los activos del Importador que en desarrollo de sus actividades ordinarias sea necesario trasladar o que el Importador determine en el giro ordinario de sus negocios que es conveniente trasladar; (</w:t>
       </w:r>
+      <w:proofErr w:type="spellStart"/>
       <w:r>
         <w:t>iii</w:t>
       </w:r>
+      <w:proofErr w:type="spellEnd"/>
       <w:r>
         <w:t>) en relación con aquellos Bienes en Garantía que por su naturaleza puedan ser trasladados temporalmente a cualquier lugar del territorio de Colombia dentro del giro ordinario de las actividades del Importador; y (</w:t>
       </w:r>
+      <w:proofErr w:type="spellStart"/>
       <w:r>
         <w:t>iv</w:t>
       </w:r>
+      <w:proofErr w:type="spellEnd"/>
       <w:r>
         <w:t>) para el traslado de los activos que sea necesario trasladar fuera de las instalaciones del Importador para efectos de su reparación, mantenimiento o reemplazo, traslado que queda autorizado expresamente por este Contrato, teniendo en cuenta que los bienes así trasladados serán retomados por el Importador una vez sean reparados, mantenidos o remplazados.</w:t>
       </w:r>
@@ -7571,8 +7913,13 @@
       <w:r>
         <w:t xml:space="preserve">El Importador acepta, reconoce y autoriza a </w:t>
       </w:r>
-      <w:r>
-        <w:t>Finkargo Colombia</w:t>
+      <w:proofErr w:type="spellStart"/>
+      <w:r>
+        <w:t>Finkargo</w:t>
+      </w:r>
+      <w:proofErr w:type="spellEnd"/>
+      <w:r>
+        <w:t xml:space="preserve"> Colombia</w:t>
       </w:r>
       <w:r>
         <w:t xml:space="preserve"> para que inscriba</w:t>
@@ -7615,14 +7962,24 @@
       <w:r>
         <w:t xml:space="preserve">) </w:t>
       </w:r>
-      <w:r>
-        <w:t>Finkargo Colombia</w:t>
+      <w:proofErr w:type="spellStart"/>
+      <w:r>
+        <w:t>Finkargo</w:t>
+      </w:r>
+      <w:proofErr w:type="spellEnd"/>
+      <w:r>
+        <w:t xml:space="preserve"> Colombia</w:t>
       </w:r>
       <w:r>
         <w:t xml:space="preserve"> podrá solicitar al Importador que firme o entregue de manera oportuna cualquier documento o instrumento adicional y que adelante cualquier acto que se considere necesario, o que sea solicitado por </w:t>
       </w:r>
-      <w:r>
-        <w:t>Finkargo Colombia</w:t>
+      <w:proofErr w:type="spellStart"/>
+      <w:r>
+        <w:t>Finkargo</w:t>
+      </w:r>
+      <w:proofErr w:type="spellEnd"/>
+      <w:r>
+        <w:t xml:space="preserve"> Colombia</w:t>
       </w:r>
       <w:r>
         <w:t xml:space="preserve">, con el fin de diligenciar e inscribir los formularios de registro, modificación, </w:t>
@@ -7645,9 +8002,11 @@
       <w:r>
         <w:t>; y (</w:t>
       </w:r>
+      <w:proofErr w:type="spellStart"/>
       <w:r>
         <w:t>ii</w:t>
       </w:r>
+      <w:proofErr w:type="spellEnd"/>
       <w:r>
         <w:t xml:space="preserve">) el Importador </w:t>
       </w:r>
@@ -7657,8 +8016,13 @@
       <w:r>
         <w:t xml:space="preserve"> a atender prontamente cualquiera de tales solicitudes y a realizar los actos requeridos por </w:t>
       </w:r>
-      <w:r>
-        <w:t>Finkargo Colombia</w:t>
+      <w:proofErr w:type="spellStart"/>
+      <w:r>
+        <w:t>Finkargo</w:t>
+      </w:r>
+      <w:proofErr w:type="spellEnd"/>
+      <w:r>
+        <w:t xml:space="preserve"> Colombia</w:t>
       </w:r>
       <w:r>
         <w:t xml:space="preserve"> a este respecto en un plazo que no exceda de, en todo caso, tres (3) Días Hábiles.</w:t>
@@ -7745,14 +8109,24 @@
       <w:r>
         <w:t xml:space="preserve"> garantiza el cumplimiento de todas las Obligaciones Garantizadas hasta la ocurrencia del pago total de las Obligaciones Garantizadas a satisfacción de </w:t>
       </w:r>
-      <w:r>
-        <w:t>Finkargo Colombia</w:t>
+      <w:proofErr w:type="spellStart"/>
+      <w:r>
+        <w:t>Finkargo</w:t>
+      </w:r>
+      <w:proofErr w:type="spellEnd"/>
+      <w:r>
+        <w:t xml:space="preserve"> Colombia</w:t>
       </w:r>
       <w:r>
         <w:t xml:space="preserve">, según sea notificado por </w:t>
       </w:r>
-      <w:r>
-        <w:t>Finkargo Colombia</w:t>
+      <w:proofErr w:type="spellStart"/>
+      <w:r>
+        <w:t>Finkargo</w:t>
+      </w:r>
+      <w:proofErr w:type="spellEnd"/>
+      <w:r>
+        <w:t xml:space="preserve"> Colombia</w:t>
       </w:r>
       <w:r>
         <w:t xml:space="preserve"> o</w:t>
@@ -7789,8 +8163,13 @@
       <w:r>
         <w:t xml:space="preserve">En la medida en que existieren saldos pendientes de pago de las Obligaciones Garantizadas, el Importador acepta, reconoce y autoriza a </w:t>
       </w:r>
-      <w:r>
-        <w:t>Finkargo Colombia</w:t>
+      <w:proofErr w:type="spellStart"/>
+      <w:r>
+        <w:t>Finkargo</w:t>
+      </w:r>
+      <w:proofErr w:type="spellEnd"/>
+      <w:r>
+        <w:t xml:space="preserve"> Colombia</w:t>
       </w:r>
       <w:r>
         <w:t xml:space="preserve"> para que inscriba las modificaciones que sea</w:t>
@@ -7811,7 +8190,15 @@
         <w:t xml:space="preserve"> </w:t>
       </w:r>
       <w:r>
-        <w:t xml:space="preserve">y (ii) prorrogar </w:t>
+        <w:t>y (</w:t>
+      </w:r>
+      <w:proofErr w:type="spellStart"/>
+      <w:r>
+        <w:t>ii</w:t>
+      </w:r>
+      <w:proofErr w:type="spellEnd"/>
+      <w:r>
+        <w:t xml:space="preserve">) prorrogar </w:t>
       </w:r>
       <w:r>
         <w:t xml:space="preserve">la </w:t>
@@ -7904,8 +8291,13 @@
       <w:r>
         <w:t xml:space="preserve">, o reembolsado, en su totalidad por el Importador a </w:t>
       </w:r>
-      <w:r>
-        <w:t>Finkargo Colombia</w:t>
+      <w:proofErr w:type="spellStart"/>
+      <w:r>
+        <w:t>Finkargo</w:t>
+      </w:r>
+      <w:proofErr w:type="spellEnd"/>
+      <w:r>
+        <w:t xml:space="preserve"> Colombia</w:t>
       </w:r>
       <w:r>
         <w:t>.</w:t>
@@ -8179,8 +8571,13 @@
         <w:t xml:space="preserve"> el título de propiedad, totalmente saneado, pleno y libre de Gravámenes (distintos a esta Garantía</w:t>
       </w:r>
       <w:r>
-        <w:t xml:space="preserve"> y cualquier garantía real que sea aplicable por ministerio de la Ley Aplicable); y (ii</w:t>
-      </w:r>
+        <w:t xml:space="preserve"> y cualquier garantía real que sea aplicable por ministerio de la Ley Aplicable); y (</w:t>
+      </w:r>
+      <w:proofErr w:type="spellStart"/>
+      <w:r>
+        <w:t>ii</w:t>
+      </w:r>
+      <w:proofErr w:type="spellEnd"/>
       <w:r>
         <w:t>)</w:t>
       </w:r>
@@ -8300,7 +8697,15 @@
         <w:pStyle w:val="Heading3"/>
       </w:pPr>
       <w:r>
-        <w:t>Los poderes conferidos a Finkargo Colombia en el presente Contrato son poderes amplios y suficientes para que el apoderado realice a su entera discreción todos los actos que considere necesarios para procurar el pago de las Obligaciones Garantizadas de conformidad con lo dispuesto en el presente Contrato.</w:t>
+        <w:t xml:space="preserve">Los poderes conferidos a </w:t>
+      </w:r>
+      <w:proofErr w:type="spellStart"/>
+      <w:r>
+        <w:t>Finkargo</w:t>
+      </w:r>
+      <w:proofErr w:type="spellEnd"/>
+      <w:r>
+        <w:t xml:space="preserve"> Colombia en el presente Contrato son poderes amplios y suficientes para que el apoderado realice a su entera discreción todos los actos que considere necesarios para procurar el pago de las Obligaciones Garantizadas de conformidad con lo dispuesto en el presente Contrato.</w:t>
       </w:r>
     </w:p>
     <w:p>
@@ -8603,8 +9008,13 @@
       <w:r>
         <w:t xml:space="preserve"> (incluyendo suministrar toda la documentación que sea solicitada por </w:t>
       </w:r>
-      <w:r>
-        <w:t>Finkargo Colombia</w:t>
+      <w:proofErr w:type="spellStart"/>
+      <w:r>
+        <w:t>Finkargo</w:t>
+      </w:r>
+      <w:proofErr w:type="spellEnd"/>
+      <w:r>
+        <w:t xml:space="preserve"> Colombia</w:t>
       </w:r>
       <w:r>
         <w:t xml:space="preserve"> con el fin de completar el registro o modificación de la Garantía en el Registro de Garantías Mobiliarias en los términos del </w:t>
@@ -8653,8 +9063,13 @@
       <w:r>
         <w:t xml:space="preserve"> Esto incluye, sin limitación, los pagos puntuales y documentados que solicite </w:t>
       </w:r>
-      <w:r>
-        <w:t>Finkargo Colombia</w:t>
+      <w:proofErr w:type="spellStart"/>
+      <w:r>
+        <w:t>Finkargo</w:t>
+      </w:r>
+      <w:proofErr w:type="spellEnd"/>
+      <w:r>
+        <w:t xml:space="preserve"> Colombia</w:t>
       </w:r>
       <w:r>
         <w:t xml:space="preserve"> de todos y cualesquiera costos y gastos documentados que se causen en relación con la preparación, envío y/o diligenciamiento de cualquier documento o la toma de cualquier acción para perfeccionar, proteger, ejecutar o mantener vigente y en pleno vigor y efecto la Garantía constituida mediante el presente Contrato a favor de </w:t>
@@ -8755,14 +9170,24 @@
       <w:r>
         <w:t xml:space="preserve">a </w:t>
       </w:r>
-      <w:r>
-        <w:t>Finkargo Colombia</w:t>
+      <w:proofErr w:type="spellStart"/>
+      <w:r>
+        <w:t>Finkargo</w:t>
+      </w:r>
+      <w:proofErr w:type="spellEnd"/>
+      <w:r>
+        <w:t xml:space="preserve"> Colombia</w:t>
       </w:r>
       <w:r>
         <w:t xml:space="preserve"> dentro de los cinco (5) Días Hábiles siguientes a la fecha en que tenga conocimiento de cualquier circunstancia o evento que afecte o modifique los derechos de </w:t>
       </w:r>
-      <w:r>
-        <w:t>Finkargo Colombia</w:t>
+      <w:proofErr w:type="spellStart"/>
+      <w:r>
+        <w:t>Finkargo</w:t>
+      </w:r>
+      <w:proofErr w:type="spellEnd"/>
+      <w:r>
+        <w:t xml:space="preserve"> Colombia</w:t>
       </w:r>
       <w:r>
         <w:t xml:space="preserve"> en virtud de este Contrato, así como de cualquier circunstancia relevante con respecto a los Bienes en Garantía que razonablemente el Importador considere que pueda poner en riesgo el cumplimiento de cualquier obligación bajo el Contrato Marco</w:t>
@@ -8781,8 +9206,13 @@
       <w:r>
         <w:t xml:space="preserve">a </w:t>
       </w:r>
-      <w:r>
-        <w:t>Finkargo Colombia</w:t>
+      <w:proofErr w:type="spellStart"/>
+      <w:r>
+        <w:t>Finkargo</w:t>
+      </w:r>
+      <w:proofErr w:type="spellEnd"/>
+      <w:r>
+        <w:t xml:space="preserve"> Colombia</w:t>
       </w:r>
       <w:r>
         <w:t xml:space="preserve"> dentro de los cinco (5) Días Hábiles siguientes a la fecha en que tenga conocimiento de cualquier demanda o proceso judicial o administrativo iniciado en su contra, como consecuencia de lo cual se cree o se pueda esperar razonablemente que se cree un Gravamen sobre los Bienes en Garantía</w:t>
@@ -8801,8 +9231,13 @@
       <w:r>
         <w:t xml:space="preserve">a </w:t>
       </w:r>
-      <w:r>
-        <w:t>Finkargo Colombia</w:t>
+      <w:proofErr w:type="spellStart"/>
+      <w:r>
+        <w:t>Finkargo</w:t>
+      </w:r>
+      <w:proofErr w:type="spellEnd"/>
+      <w:r>
+        <w:t xml:space="preserve"> Colombia</w:t>
       </w:r>
       <w:r>
         <w:t xml:space="preserve">, </w:t>
@@ -9270,15 +9705,19 @@
       <w:r>
         <w:t>) pago directo; (</w:t>
       </w:r>
+      <w:proofErr w:type="spellStart"/>
       <w:r>
         <w:t>ii</w:t>
       </w:r>
+      <w:proofErr w:type="spellEnd"/>
       <w:r>
         <w:t>) ejecución especial; (</w:t>
       </w:r>
+      <w:proofErr w:type="spellStart"/>
       <w:r>
         <w:t>iii</w:t>
       </w:r>
+      <w:proofErr w:type="spellEnd"/>
       <w:r>
         <w:t xml:space="preserve">) ejecución judicial. El ejercicio de cualquier derecho por parte de </w:t>
       </w:r>
@@ -9320,7 +9759,15 @@
       </w:pPr>
       <w:bookmarkStart w:id="66" w:name="_Hlk143859035"/>
       <w:r>
-        <w:t>Si como resultado de la ejecución de la Garantía Finkargo Colombia recibe Pesos, las Obligaciones Garantizadas que estén denominadas en Dólares serán pagadas a la TRM vigente para la fecha en que se reciba el pago de la enajenación de los Bienes en Garantía de acuerdo con los procedimientos aquí previstos o de la fecha en que se realice la dación en pago o el pago en especie con los Bienes en Garantía.</w:t>
+        <w:t xml:space="preserve">Si como resultado de la ejecución de la Garantía </w:t>
+      </w:r>
+      <w:proofErr w:type="spellStart"/>
+      <w:r>
+        <w:t>Finkargo</w:t>
+      </w:r>
+      <w:proofErr w:type="spellEnd"/>
+      <w:r>
+        <w:t xml:space="preserve"> Colombia recibe Pesos, las Obligaciones Garantizadas que estén denominadas en Dólares serán pagadas a la TRM vigente para la fecha en que se reciba el pago de la enajenación de los Bienes en Garantía de acuerdo con los procedimientos aquí previstos o de la fecha en que se realice la dación en pago o el pago en especie con los Bienes en Garantía.</w:t>
       </w:r>
     </w:p>
     <w:p>
@@ -9579,9 +10026,11 @@
       <w:r>
         <w:t xml:space="preserve"> (</w:t>
       </w:r>
+      <w:proofErr w:type="spellStart"/>
       <w:r>
         <w:t>ii</w:t>
       </w:r>
+      <w:proofErr w:type="spellEnd"/>
       <w:r>
         <w:t>) a través de notario público</w:t>
       </w:r>
@@ -9592,7 +10041,15 @@
         <w:t xml:space="preserve"> o </w:t>
       </w:r>
       <w:r>
-        <w:t xml:space="preserve">(iii) a través </w:t>
+        <w:t>(</w:t>
+      </w:r>
+      <w:proofErr w:type="spellStart"/>
+      <w:r>
+        <w:t>iii</w:t>
+      </w:r>
+      <w:proofErr w:type="spellEnd"/>
+      <w:r>
+        <w:t xml:space="preserve">) a través </w:t>
       </w:r>
       <w:r>
         <w:t xml:space="preserve">del </w:t>
@@ -9928,7 +10385,15 @@
         <w:t>Partes</w:t>
       </w:r>
       <w:r>
-        <w:t xml:space="preserve"> acuerdan que el avalúo de los Bienes en Garantía lo hará un Avaluador Independiente que cumpla con los Criterios de Independencia y Experiencia, seleccionado a discreción de </w:t>
+        <w:t xml:space="preserve"> acuerdan que el avalúo de los Bienes en Garantía lo hará un </w:t>
+      </w:r>
+      <w:proofErr w:type="spellStart"/>
+      <w:r>
+        <w:t>Avaluador</w:t>
+      </w:r>
+      <w:proofErr w:type="spellEnd"/>
+      <w:r>
+        <w:t xml:space="preserve"> Independiente que cumpla con los Criterios de Independencia y Experiencia, seleccionado a discreción de </w:t>
       </w:r>
       <w:r>
         <w:t>la(s) Parte(s) Garantizada(s)</w:t>
@@ -10507,7 +10972,15 @@
         <w:t>(n)</w:t>
       </w:r>
       <w:r>
-        <w:t xml:space="preserve"> los servicios de un Avaluador Independiente </w:t>
+        <w:t xml:space="preserve"> los servicios de un </w:t>
+      </w:r>
+      <w:proofErr w:type="spellStart"/>
+      <w:r>
+        <w:t>Avaluador</w:t>
+      </w:r>
+      <w:proofErr w:type="spellEnd"/>
+      <w:r>
+        <w:t xml:space="preserve"> Independiente </w:t>
       </w:r>
       <w:r>
         <w:t xml:space="preserve">de conformidad con lo establecido en la </w:t>
@@ -10640,7 +11113,15 @@
         <w:t>Partes</w:t>
       </w:r>
       <w:r>
-        <w:t xml:space="preserve"> acuerdan que la selección del Avaluador Independiente y de la Valoración se realizará de conformidad con la </w:t>
+        <w:t xml:space="preserve"> acuerdan que la selección del </w:t>
+      </w:r>
+      <w:proofErr w:type="spellStart"/>
+      <w:r>
+        <w:t>Avaluador</w:t>
+      </w:r>
+      <w:proofErr w:type="spellEnd"/>
+      <w:r>
+        <w:t xml:space="preserve"> Independiente y de la Valoración se realizará de conformidad con la </w:t>
       </w:r>
       <w:r>
         <w:rPr>
@@ -10692,7 +11173,15 @@
         <w:fldChar w:fldCharType="end"/>
       </w:r>
       <w:r>
-        <w:t xml:space="preserve">, bajo el entendido que en caso de que ninguna entidad pueda ser contratada como Avaluador Independiente, </w:t>
+        <w:t xml:space="preserve">, bajo el entendido que en caso de que ninguna entidad pueda ser contratada como </w:t>
+      </w:r>
+      <w:proofErr w:type="spellStart"/>
+      <w:r>
+        <w:t>Avaluador</w:t>
+      </w:r>
+      <w:proofErr w:type="spellEnd"/>
+      <w:r>
+        <w:t xml:space="preserve"> Independiente, </w:t>
       </w:r>
       <w:r>
         <w:t>la(s) Parte(s) Garantizada(s)</w:t>
@@ -10973,13 +11462,21 @@
         <w:t>Poder Especial</w:t>
       </w:r>
       <w:r>
-        <w:t xml:space="preserve">”). El Poder Especial aquí otorgado es irrevocable y ha sido otorgado en beneficio de </w:t>
+        <w:t xml:space="preserve">”). El Poder Especial aquí otorgado es irrevocable y ha sido otorgado en beneficio </w:t>
+      </w:r>
+      <w:proofErr w:type="gramStart"/>
+      <w:r>
+        <w:t xml:space="preserve">de </w:t>
       </w:r>
       <w:r>
         <w:t xml:space="preserve"> </w:t>
       </w:r>
       <w:r>
-        <w:t>la(s) Parte(s) Garantizada(s), según sea el caso</w:t>
+        <w:t>la</w:t>
+      </w:r>
+      <w:proofErr w:type="gramEnd"/>
+      <w:r>
+        <w:t>(s) Parte(s) Garantizada(s), según sea el caso</w:t>
       </w:r>
       <w:r>
         <w:t xml:space="preserve">. Con la suscripción del presente Contrato </w:t>
@@ -11017,7 +11514,15 @@
         <w:t>Sección 7.01</w:t>
       </w:r>
       <w:r>
-        <w:t>; o (z) causar que un tercero reciba, los Bienes en Garantía en pago por un valor equivalente al 100% de la Valoración de los mismos.</w:t>
+        <w:t xml:space="preserve">; o (z) causar que un tercero reciba, los Bienes en Garantía en pago por un valor equivalente al 100% de la Valoración de </w:t>
+      </w:r>
+      <w:proofErr w:type="gramStart"/>
+      <w:r>
+        <w:t>los mismos</w:t>
+      </w:r>
+      <w:proofErr w:type="gramEnd"/>
+      <w:r>
+        <w:t>.</w:t>
       </w:r>
     </w:p>
     <w:p>
@@ -11265,7 +11770,15 @@
         <w:t>Finkargo Colombia</w:t>
       </w:r>
       <w:r>
-        <w:t xml:space="preserve"> contratará los servicios de un Avaluador Independiente que cumpla con los Criterios de Independencia y Experiencia y cualesquiera otros criterios que le sean exigibles bajo la Ley Aplicable, el cual se encargará de efectuar el avalúo comercial de los Bienes en Garantía, de conformidad con las siguientes reglas:</w:t>
+        <w:t xml:space="preserve"> contratará los servicios de un </w:t>
+      </w:r>
+      <w:proofErr w:type="spellStart"/>
+      <w:r>
+        <w:t>Avaluador</w:t>
+      </w:r>
+      <w:proofErr w:type="spellEnd"/>
+      <w:r>
+        <w:t xml:space="preserve"> Independiente que cumpla con los Criterios de Independencia y Experiencia y cualesquiera otros criterios que le sean exigibles bajo la Ley Aplicable, el cual se encargará de efectuar el avalúo comercial de los Bienes en Garantía, de conformidad con las siguientes reglas:</w:t>
       </w:r>
     </w:p>
     <w:p>
@@ -11302,7 +11815,15 @@
         <w:t>(n)</w:t>
       </w:r>
       <w:r>
-        <w:t xml:space="preserve"> los servicios de un Avaluador Independiente en los términos establecidos en esta </w:t>
+        <w:t xml:space="preserve"> los servicios de un </w:t>
+      </w:r>
+      <w:proofErr w:type="spellStart"/>
+      <w:r>
+        <w:t>Avaluador</w:t>
+      </w:r>
+      <w:proofErr w:type="spellEnd"/>
+      <w:r>
+        <w:t xml:space="preserve"> Independiente en los términos establecidos en esta </w:t>
       </w:r>
       <w:r>
         <w:rPr>
@@ -11346,7 +11867,15 @@
         <w:t xml:space="preserve"> </w:t>
       </w:r>
       <w:r>
-        <w:t xml:space="preserve">En el evento en que la contratación del Avaluador Independiente no pueda realizarse en el plazo señalado, dicho plazo será extendido por el tiempo que, a juicio de </w:t>
+        <w:t xml:space="preserve">En el evento en que la contratación del </w:t>
+      </w:r>
+      <w:proofErr w:type="spellStart"/>
+      <w:r>
+        <w:t>Avaluador</w:t>
+      </w:r>
+      <w:proofErr w:type="spellEnd"/>
+      <w:r>
+        <w:t xml:space="preserve"> Independiente no pueda realizarse en el plazo señalado, dicho plazo será extendido por el tiempo que, a juicio de </w:t>
       </w:r>
       <w:r>
         <w:t>la(s) Parte(s) Garantizada(s)</w:t>
@@ -11362,7 +11891,15 @@
       </w:pPr>
       <w:bookmarkStart w:id="89" w:name="_Ref129868124"/>
       <w:r>
-        <w:t xml:space="preserve">En caso de que ninguna entidad pueda ser contratada como Avaluador Independiente, </w:t>
+        <w:t xml:space="preserve">En caso de que ninguna entidad pueda ser contratada como </w:t>
+      </w:r>
+      <w:proofErr w:type="spellStart"/>
+      <w:r>
+        <w:t>Avaluador</w:t>
+      </w:r>
+      <w:proofErr w:type="spellEnd"/>
+      <w:r>
+        <w:t xml:space="preserve"> Independiente, </w:t>
       </w:r>
       <w:r>
         <w:t>la(s) Parte(s) Garantizada(s)</w:t>
@@ -11384,7 +11921,15 @@
       </w:pPr>
       <w:bookmarkStart w:id="90" w:name="_Ref129868074"/>
       <w:r>
-        <w:t>Una vez seleccionado el Avaluador Independiente, este deberá iniciar de forma inmediata las labores y actividades tendientes a determinar el avalúo de los Bienes en Garantía (la “</w:t>
+        <w:t xml:space="preserve">Una vez seleccionado el </w:t>
+      </w:r>
+      <w:proofErr w:type="spellStart"/>
+      <w:r>
+        <w:t>Avaluador</w:t>
+      </w:r>
+      <w:proofErr w:type="spellEnd"/>
+      <w:r>
+        <w:t xml:space="preserve"> Independiente, este deberá iniciar de forma inmediata las labores y actividades tendientes a determinar el avalúo de los Bienes en Garantía (la “</w:t>
       </w:r>
       <w:r>
         <w:rPr>
@@ -11664,8 +12209,13 @@
       <w:r>
         <w:t xml:space="preserve"> a </w:t>
       </w:r>
-      <w:r>
-        <w:t>Finkargo Colombia</w:t>
+      <w:proofErr w:type="spellStart"/>
+      <w:r>
+        <w:t>Finkargo</w:t>
+      </w:r>
+      <w:proofErr w:type="spellEnd"/>
+      <w:r>
+        <w:t xml:space="preserve"> Colombia</w:t>
       </w:r>
       <w:r>
         <w:t xml:space="preserve"> y/o a la(s) Parte(s) Garantizada(s)</w:t>
@@ -11673,8 +12223,13 @@
       <w:r>
         <w:t xml:space="preserve">, sea en virtud de las Leyes Aplicables o en virtud de actos o decisiones de una Autoridad Gubernamental, y todos y cada uno de tales derechos, poderes, facultades y recursos, sea que específicamente se otorguen aquí o que existan de otro modo o simultáneamente, podrán ejercerse parcial o totalmente y con la frecuencia y en el orden en que </w:t>
       </w:r>
-      <w:r>
-        <w:t>Finkargo Colombia</w:t>
+      <w:proofErr w:type="spellStart"/>
+      <w:r>
+        <w:t>Finkargo</w:t>
+      </w:r>
+      <w:proofErr w:type="spellEnd"/>
+      <w:r>
+        <w:t xml:space="preserve"> Colombia</w:t>
       </w:r>
       <w:r>
         <w:t xml:space="preserve"> y/o la(s) Parte(s) Garantizada(s)</w:t>
@@ -11694,6 +12249,7 @@
         <w:pStyle w:val="Heading3"/>
       </w:pPr>
       <w:r>
+        <w:lastRenderedPageBreak/>
         <w:t xml:space="preserve">Todos estos derechos, poderes, facultades y recursos serán acumulables y el ejercicio o el inicio del ejercicio de uno no implicarán la renuncia de ninguno otro de dichos derechos. Ni la demora ni la omisión por parte de </w:t>
       </w:r>
       <w:r>
@@ -11702,8 +12258,13 @@
       <w:r>
         <w:t xml:space="preserve">en el ejercicio de tales derechos, poderes facultades y recursos, ni la falta de renovación o prórroga de alguna de las Obligaciones Garantizadas menoscabará los derechos de </w:t>
       </w:r>
-      <w:r>
-        <w:t>Finkargo Colombia</w:t>
+      <w:proofErr w:type="spellStart"/>
+      <w:r>
+        <w:t>Finkargo</w:t>
+      </w:r>
+      <w:proofErr w:type="spellEnd"/>
+      <w:r>
+        <w:t xml:space="preserve"> Colombia</w:t>
       </w:r>
       <w:r>
         <w:t>, poderes, facultades y recursos en virtud del Contrato Marco y cualquier Garantía Adicional, ni constituirá una renuncia de estos.</w:t>
@@ -11902,7 +12463,11 @@
         <w:pStyle w:val="Heading3"/>
       </w:pPr>
       <w:r>
-        <w:t>Las restricciones contenidas en esta cláusula seguirán aplicándose durante un período de tres (3) años tras la terminación o expiración del presente Contrato, lo que ocurra primero. Las disposiciones de esta cláusula prevalecerán sobre cualquier acuerdo de confidencialidad previo entre las Partes en relación con el objeto del presente Contrato.</w:t>
+        <w:t xml:space="preserve">Las restricciones contenidas en esta cláusula seguirán aplicándose durante un período de tres (3) años tras la terminación o expiración del presente Contrato, lo que ocurra </w:t>
+      </w:r>
+      <w:r>
+        <w:lastRenderedPageBreak/>
+        <w:t>primero. Las disposiciones de esta cláusula prevalecerán sobre cualquier acuerdo de confidencialidad previo entre las Partes en relación con el objeto del presente Contrato.</w:t>
       </w:r>
     </w:p>
     <w:p>
@@ -12061,8 +12626,13 @@
       <w:pPr>
         <w:pStyle w:val="Heading3"/>
       </w:pPr>
-      <w:r>
-        <w:t>Finkargo Colombia</w:t>
+      <w:proofErr w:type="spellStart"/>
+      <w:r>
+        <w:t>Finkargo</w:t>
+      </w:r>
+      <w:proofErr w:type="spellEnd"/>
+      <w:r>
+        <w:t xml:space="preserve"> Colombia</w:t>
       </w:r>
       <w:r>
         <w:t xml:space="preserve"> es responsable de los Datos Personales del Importador y de toda la información a la cual tenga acceso en el marco de este Contrato, así como de los Datos Personales contenidos en los Anexos, formularios, facturas y demás documentos generados en el marco de ejecución del presente Contrato.</w:t>
@@ -12075,20 +12645,59 @@
       <w:r>
         <w:t xml:space="preserve">El Importador autoriza de manera libre, voluntaria, previa, expresa, a </w:t>
       </w:r>
-      <w:r>
-        <w:t>Finkargo Colombia</w:t>
-      </w:r>
-      <w:r>
-        <w:t xml:space="preserve"> y sus Afiliadas, así como a Community EM Credit Fund SCA., SICAV-RAIF, Fiduciaria Scotiabank Colpatria S.A., Manejo Técnico de Información S.A. (y/o a quien, de tiempo en tiempo, durante la Vigencia, lleve a cabo las funciones de éste para con </w:t>
-      </w:r>
-      <w:r>
-        <w:t>Finkargo Colombia</w:t>
+      <w:proofErr w:type="spellStart"/>
+      <w:r>
+        <w:t>Finkargo</w:t>
+      </w:r>
+      <w:proofErr w:type="spellEnd"/>
+      <w:r>
+        <w:t xml:space="preserve"> Colombia</w:t>
+      </w:r>
+      <w:r>
+        <w:t xml:space="preserve"> y sus Afiliadas, así como a </w:t>
+      </w:r>
+      <w:proofErr w:type="spellStart"/>
+      <w:r>
+        <w:t>Community</w:t>
+      </w:r>
+      <w:proofErr w:type="spellEnd"/>
+      <w:r>
+        <w:t xml:space="preserve"> EM </w:t>
+      </w:r>
+      <w:proofErr w:type="spellStart"/>
+      <w:r>
+        <w:t>Credit</w:t>
+      </w:r>
+      <w:proofErr w:type="spellEnd"/>
+      <w:r>
+        <w:t xml:space="preserve"> </w:t>
+      </w:r>
+      <w:proofErr w:type="spellStart"/>
+      <w:r>
+        <w:t>Fund</w:t>
+      </w:r>
+      <w:proofErr w:type="spellEnd"/>
+      <w:r>
+        <w:t xml:space="preserve"> SCA., SICAV-RAIF, Fiduciaria Scotiabank Colpatria S.A., Manejo Técnico de Información S.A. (y/o a quien, de tiempo en tiempo, durante la Vigencia, lleve a cabo las funciones de éste para con </w:t>
+      </w:r>
+      <w:proofErr w:type="spellStart"/>
+      <w:r>
+        <w:t>Finkargo</w:t>
+      </w:r>
+      <w:proofErr w:type="spellEnd"/>
+      <w:r>
+        <w:t xml:space="preserve"> Colombia</w:t>
       </w:r>
       <w:r>
         <w:t xml:space="preserve"> y/o el Beneficiario a la Fecha de Firma) y Tecnología en Cuentas por Cobrar S.A.S. (y/o a quien, de tiempo en tiempo, durante la Vigencia, lleve a cabo las funciones de éste para con </w:t>
       </w:r>
-      <w:r>
-        <w:t>Finkargo Colombia</w:t>
+      <w:proofErr w:type="spellStart"/>
+      <w:r>
+        <w:t>Finkargo</w:t>
+      </w:r>
+      <w:proofErr w:type="spellEnd"/>
+      <w:r>
+        <w:t xml:space="preserve"> Colombia</w:t>
       </w:r>
       <w:r>
         <w:t xml:space="preserve"> y/o el Beneficiario a la Fecha de Firma), para que en los términos legalmente establecidos realice la recolección, almacenamiento, uso, circulación, supresión, transmisión, transferencia, y en general, el tratamiento de los Datos Personales que se ha procedido a entregar o que entregará, en virtud de las relaciones legales, contractuales, comerciales y/o de cualquier otra que surja, en desarrollo y ejecución de los fines descritos en este Contrato.</w:t>
@@ -12101,11 +12710,28 @@
       <w:r>
         <w:t xml:space="preserve">El Importador autoriza a </w:t>
       </w:r>
-      <w:r>
-        <w:t>Finkargo Colombia</w:t>
-      </w:r>
-      <w:r>
-        <w:t xml:space="preserve"> para que trate, transfiera o transmita los Datos Personales a terceros, como patrimonios autónomos, y/o beneficiarios de los mismos, incluyendo al Beneficiario, incluso a países que no cuenten con los niveles adecuados de protección, con las finalidades establecidas en la Política de </w:t>
+      <w:proofErr w:type="spellStart"/>
+      <w:r>
+        <w:t>Finkargo</w:t>
+      </w:r>
+      <w:proofErr w:type="spellEnd"/>
+      <w:r>
+        <w:t xml:space="preserve"> Colombia</w:t>
+      </w:r>
+      <w:r>
+        <w:t xml:space="preserve"> para que trate, transfiera o transmita los Datos Personales a terceros, como patrimonios autónomos, y/o beneficiarios de </w:t>
+      </w:r>
+      <w:proofErr w:type="gramStart"/>
+      <w:r>
+        <w:t>los mismos</w:t>
+      </w:r>
+      <w:proofErr w:type="gramEnd"/>
+      <w:r>
+        <w:t xml:space="preserve">, incluyendo al Beneficiario, incluso a países que no cuenten con los niveles adecuados de protección, </w:t>
+      </w:r>
+      <w:r>
+        <w:lastRenderedPageBreak/>
+        <w:t xml:space="preserve">con las finalidades establecidas en la Política de </w:t>
       </w:r>
       <w:r>
         <w:t>Privacidad</w:t>
@@ -12188,8 +12814,13 @@
       <w:r>
         <w:t xml:space="preserve">) a través de los mecanismos dispuestos para tal fin por </w:t>
       </w:r>
-      <w:r>
-        <w:t>Finkargo Colombia</w:t>
+      <w:proofErr w:type="spellStart"/>
+      <w:r>
+        <w:t>Finkargo</w:t>
+      </w:r>
+      <w:proofErr w:type="spellEnd"/>
+      <w:r>
+        <w:t xml:space="preserve"> Colombia</w:t>
       </w:r>
       <w:r>
         <w:t xml:space="preserve"> o sus Afiliadas, conforme a la Política de </w:t>
@@ -12383,11 +13014,19 @@
         </w:rPr>
         <w:t xml:space="preserve">que esté dirigida a </w:t>
       </w:r>
-      <w:r>
-        <w:rPr>
-          <w:lang w:val="es-CO"/>
-        </w:rPr>
-        <w:t>Finkargo Colombia</w:t>
+      <w:proofErr w:type="spellStart"/>
+      <w:r>
+        <w:rPr>
+          <w:lang w:val="es-CO"/>
+        </w:rPr>
+        <w:t>Finkargo</w:t>
+      </w:r>
+      <w:proofErr w:type="spellEnd"/>
+      <w:r>
+        <w:rPr>
+          <w:lang w:val="es-CO"/>
+        </w:rPr>
+        <w:t xml:space="preserve"> Colombia</w:t>
       </w:r>
       <w:r>
         <w:rPr>
@@ -12597,8 +13236,13 @@
             <w:r>
               <w:t xml:space="preserve">A </w:t>
             </w:r>
-            <w:r>
-              <w:t>Finkargo Colombia</w:t>
+            <w:proofErr w:type="spellStart"/>
+            <w:r>
+              <w:t>Finkargo</w:t>
+            </w:r>
+            <w:proofErr w:type="spellEnd"/>
+            <w:r>
+              <w:t xml:space="preserve"> Colombia</w:t>
             </w:r>
             <w:r>
               <w:t>:</w:t>
@@ -12677,28 +13321,45 @@
               <w:br/>
               <w:t xml:space="preserve">E-mail: </w:t>
             </w:r>
+            <w:r>
+              <w:fldChar w:fldCharType="begin"/>
+            </w:r>
+            <w:r>
+              <w:rPr>
+                <w:lang w:val="en-US"/>
+              </w:rPr>
+              <w:instrText xml:space="preserve"> HYPERLINK "mailto:andres.gonzalez@finkargo.com" </w:instrText>
+            </w:r>
+            <w:r>
+              <w:fldChar w:fldCharType="separate"/>
+            </w:r>
+            <w:r>
+              <w:rPr>
+                <w:rStyle w:val="Hyperlink"/>
+                <w:lang w:val="pt-PT"/>
+              </w:rPr>
+              <w:t>andres.gonzalez@finkargo.com</w:t>
+            </w:r>
+            <w:r>
+              <w:rPr>
+                <w:rStyle w:val="Hyperlink"/>
+                <w:lang w:val="pt-PT"/>
+              </w:rPr>
+              <w:fldChar w:fldCharType="end"/>
+            </w:r>
+            <w:r>
+              <w:rPr>
+                <w:lang w:val="pt-PT"/>
+              </w:rPr>
+              <w:t xml:space="preserve"> </w:t>
+            </w:r>
+            <w:r>
+              <w:rPr>
+                <w:lang w:val="pt-PT"/>
+              </w:rPr>
+              <w:br/>
+            </w:r>
             <w:hyperlink r:id="rId15" w:history="1">
-              <w:r>
-                <w:rPr>
-                  <w:rStyle w:val="Hyperlink"/>
-                  <w:lang w:val="pt-PT"/>
-                </w:rPr>
-                <w:t>andres.gonzalez@finkargo.com</w:t>
-              </w:r>
-            </w:hyperlink>
-            <w:r>
-              <w:rPr>
-                <w:lang w:val="pt-PT"/>
-              </w:rPr>
-              <w:t xml:space="preserve"> </w:t>
-            </w:r>
-            <w:r>
-              <w:rPr>
-                <w:lang w:val="pt-PT"/>
-              </w:rPr>
-              <w:br/>
-            </w:r>
-            <w:hyperlink r:id="rId16" w:history="1">
               <w:r>
                 <w:rPr>
                   <w:rStyle w:val="Hyperlink"/>
@@ -12713,7 +13374,7 @@
               </w:rPr>
               <w:br/>
             </w:r>
-            <w:hyperlink r:id="rId17" w:history="1">
+            <w:hyperlink r:id="rId16" w:history="1">
               <w:r>
                 <w:rPr>
                   <w:rStyle w:val="Hyperlink"/>
@@ -12863,6 +13524,7 @@
         <w:pStyle w:val="Heading3"/>
       </w:pPr>
       <w:r>
+        <w:lastRenderedPageBreak/>
         <w:t xml:space="preserve">Todas las modificaciones, adiciones, aclaraciones y/o renuncias que se efectúen al presente Contrato, serán válidas cuando consten por escrito y estén debidamente firmadas por los </w:t>
       </w:r>
       <w:r>
@@ -12894,8 +13556,13 @@
       <w:r>
         <w:t xml:space="preserve"> podrán ser realizadas por </w:t>
       </w:r>
-      <w:r>
-        <w:t>Finkargo Colombia</w:t>
+      <w:proofErr w:type="spellStart"/>
+      <w:r>
+        <w:t>Finkargo</w:t>
+      </w:r>
+      <w:proofErr w:type="spellEnd"/>
+      <w:r>
+        <w:t xml:space="preserve"> Colombia</w:t>
       </w:r>
       <w:r>
         <w:t xml:space="preserve"> sin el consentimiento del Importador en cumplimiento de los términos y condiciones previstos en el presente Contrato</w:t>
@@ -13086,8 +13753,13 @@
       <w:r>
         <w:t xml:space="preserve"> del Contrato Marco, </w:t>
       </w:r>
-      <w:r>
-        <w:t>Finkargo Colombia</w:t>
+      <w:proofErr w:type="spellStart"/>
+      <w:r>
+        <w:t>Finkargo</w:t>
+      </w:r>
+      <w:proofErr w:type="spellEnd"/>
+      <w:r>
+        <w:t xml:space="preserve"> Colombia</w:t>
       </w:r>
       <w:r>
         <w:t xml:space="preserve"> </w:t>
@@ -13122,7 +13794,15 @@
         <w:t xml:space="preserve"> </w:t>
       </w:r>
       <w:r>
-        <w:t>sin el consentimiento previo, escrito y expreso de Finkargo Colombia</w:t>
+        <w:t xml:space="preserve">sin el consentimiento previo, escrito y expreso de </w:t>
+      </w:r>
+      <w:proofErr w:type="spellStart"/>
+      <w:r>
+        <w:t>Finkargo</w:t>
+      </w:r>
+      <w:proofErr w:type="spellEnd"/>
+      <w:r>
+        <w:t xml:space="preserve"> Colombia</w:t>
       </w:r>
       <w:r>
         <w:t>.</w:t>
@@ -13359,7 +14039,19 @@
         </w:rPr>
       </w:pPr>
       <w:r>
-        <w:t>. Forman parte integral del presente Contrato todos sus Anexos, incluyendo los que se incorporen con posterioridad a la firma del mismo.</w:t>
+        <w:t xml:space="preserve">. Forman parte integral del presente Contrato todos sus Anexos, </w:t>
+      </w:r>
+      <w:r>
+        <w:lastRenderedPageBreak/>
+        <w:t xml:space="preserve">incluyendo los que se incorporen con posterioridad a la firma </w:t>
+      </w:r>
+      <w:proofErr w:type="gramStart"/>
+      <w:r>
+        <w:t>del mismo</w:t>
+      </w:r>
+      <w:proofErr w:type="gramEnd"/>
+      <w:r>
+        <w:t>.</w:t>
       </w:r>
     </w:p>
     <w:p>
@@ -13411,7 +14103,15 @@
         <w:t xml:space="preserve"> de </w:t>
       </w:r>
       <w:r>
-        <w:t>firmas electrónicas DocuSign, de conformidad con la Ley 527 de 1999 y el Decreto 2364 de 2012. Estas firmas surtirán los mismos efectos jurídicos como si constara por firma autógrafa. Las Partes otorgan su pleno consentimiento para obligarse legalmente conforme a los términos del presente Contrato</w:t>
+        <w:t xml:space="preserve">firmas electrónicas </w:t>
+      </w:r>
+      <w:proofErr w:type="spellStart"/>
+      <w:r>
+        <w:t>DocuSign</w:t>
+      </w:r>
+      <w:proofErr w:type="spellEnd"/>
+      <w:r>
+        <w:t>, de conformidad con la Ley 527 de 1999 y el Decreto 2364 de 2012. Estas firmas surtirán los mismos efectos jurídicos como si constara por firma autógrafa. Las Partes otorgan su pleno consentimiento para obligarse legalmente conforme a los términos del presente Contrato</w:t>
       </w:r>
       <w:r>
         <w:t>.</w:t>
@@ -13512,8 +14212,13 @@
             </w:r>
             <w:r>
               <w:br/>
-              <w:t>John Elvis Jiménez Jiménez</w:t>
-            </w:r>
+              <w:t xml:space="preserve">John Elvis Jiménez </w:t>
+            </w:r>
+            <w:proofErr w:type="spellStart"/>
+            <w:r>
+              <w:t>Jiménez</w:t>
+            </w:r>
+            <w:proofErr w:type="spellEnd"/>
             <w:r>
               <w:br/>
               <w:t>C.C.</w:t>
@@ -13617,8 +14322,8 @@
           <w:lang w:val="es-CO"/>
         </w:rPr>
         <w:sectPr>
-          <w:headerReference w:type="default" r:id="rId18"/>
-          <w:footerReference w:type="default" r:id="rId19"/>
+          <w:headerReference w:type="default" r:id="rId17"/>
+          <w:footerReference w:type="default" r:id="rId18"/>
           <w:pgSz w:w="12240" w:h="15840" w:code="1"/>
           <w:pgMar w:top="1134" w:right="1134" w:bottom="1134" w:left="1134" w:header="709" w:footer="709" w:gutter="0"/>
           <w:pgNumType w:start="1"/>
@@ -13640,6 +14345,7 @@
         <w:rPr>
           <w:u w:val="none"/>
         </w:rPr>
+        <w:lastRenderedPageBreak/>
         <w:t>ANEXO A</w:t>
       </w:r>
       <w:r>
@@ -13688,8 +14394,13 @@
         <w:t>valor Cupo de Operaciones en letras</w:t>
       </w:r>
       <w:r>
-        <w:t>] Dólares, (USD[</w:t>
-      </w:r>
+        <w:t>] Dólares, (</w:t>
+      </w:r>
+      <w:proofErr w:type="gramStart"/>
+      <w:r>
+        <w:t>USD[</w:t>
+      </w:r>
+      <w:proofErr w:type="gramEnd"/>
       <w:r>
         <w:rPr>
           <w:highlight w:val="yellow"/>
@@ -13750,6 +14461,7 @@
         <w:rPr>
           <w:u w:val="none"/>
         </w:rPr>
+        <w:lastRenderedPageBreak/>
         <w:t>ANEXO B</w:t>
       </w:r>
       <w:r>
@@ -13826,6 +14538,7 @@
         <w:rPr>
           <w:u w:val="none"/>
         </w:rPr>
+        <w:lastRenderedPageBreak/>
         <w:t>ANEXO C</w:t>
       </w:r>
       <w:r>
@@ -13874,6 +14587,7 @@
             <w:r>
               <w:t xml:space="preserve"> </w:t>
             </w:r>
+            <w:proofErr w:type="gramStart"/>
             <w:r>
               <w:rPr>
                 <w:sz w:val="18"/>
@@ -13894,7 +14608,15 @@
                 <w:sz w:val="18"/>
                 <w:szCs w:val="21"/>
               </w:rPr>
-              <w:t>] de [</w:t>
+              <w:t>]</w:t>
+            </w:r>
+            <w:proofErr w:type="gramEnd"/>
+            <w:r>
+              <w:rPr>
+                <w:sz w:val="18"/>
+                <w:szCs w:val="21"/>
+              </w:rPr>
+              <w:t xml:space="preserve"> de [</w:t>
             </w:r>
             <w:r>
               <w:rPr>
@@ -14035,6 +14757,7 @@
               <w:t xml:space="preserve">NOMBRE DEL </w:t>
             </w:r>
             <w:commentRangeStart w:id="127"/>
+            <w:proofErr w:type="gramStart"/>
             <w:r>
               <w:rPr>
                 <w:b/>
@@ -14065,6 +14788,7 @@
             </w:r>
             <w:bookmarkEnd w:id="126"/>
             <w:commentRangeEnd w:id="127"/>
+            <w:proofErr w:type="gramEnd"/>
             <w:r>
               <w:rPr>
                 <w:rStyle w:val="CommentReference"/>
@@ -14183,6 +14907,7 @@
             <w:r>
               <w:t xml:space="preserve"> </w:t>
             </w:r>
+            <w:proofErr w:type="gramStart"/>
             <w:r>
               <w:rPr>
                 <w:sz w:val="18"/>
@@ -14203,7 +14928,15 @@
                 <w:sz w:val="18"/>
                 <w:szCs w:val="21"/>
               </w:rPr>
-              <w:t>] de [</w:t>
+              <w:t>]</w:t>
+            </w:r>
+            <w:proofErr w:type="gramEnd"/>
+            <w:r>
+              <w:rPr>
+                <w:sz w:val="18"/>
+                <w:szCs w:val="21"/>
+              </w:rPr>
+              <w:t xml:space="preserve"> de [</w:t>
             </w:r>
             <w:r>
               <w:rPr>
@@ -14380,7 +15113,23 @@
                 <w:sz w:val="18"/>
                 <w:szCs w:val="18"/>
               </w:rPr>
-              <w:t xml:space="preserve">(b) Finkargo Colombia S.A.S. </w:t>
+              <w:t xml:space="preserve">(b) </w:t>
+            </w:r>
+            <w:proofErr w:type="spellStart"/>
+            <w:r>
+              <w:rPr>
+                <w:sz w:val="18"/>
+                <w:szCs w:val="18"/>
+              </w:rPr>
+              <w:t>Finkargo</w:t>
+            </w:r>
+            <w:proofErr w:type="spellEnd"/>
+            <w:r>
+              <w:rPr>
+                <w:sz w:val="18"/>
+                <w:szCs w:val="18"/>
+              </w:rPr>
+              <w:t xml:space="preserve"> Colombia S.A.S. </w:t>
             </w:r>
             <w:r>
               <w:rPr>
@@ -14389,7 +15138,27 @@
                 <w:szCs w:val="18"/>
                 <w:lang w:eastAsia="ja-JP"/>
               </w:rPr>
-              <w:t>al cual el Patrimonio Autónomo FC – Finkargo Colombia, identificado con NIT 830.053.994-4. constituido mediante contrato de fiducia mercantil de fecha 6 de julio de 2022 y modificado integralmente el 20 de septiembre de 2022, y representado por Fiduciaria Scotiabank Colpatria S.A. (el “</w:t>
+              <w:t xml:space="preserve">al cual el Patrimonio Autónomo FC – </w:t>
+            </w:r>
+            <w:proofErr w:type="spellStart"/>
+            <w:r>
+              <w:rPr>
+                <w:rFonts w:eastAsia="MS Mincho" w:cs="Open Sans"/>
+                <w:sz w:val="18"/>
+                <w:szCs w:val="18"/>
+                <w:lang w:eastAsia="ja-JP"/>
+              </w:rPr>
+              <w:t>Finkargo</w:t>
+            </w:r>
+            <w:proofErr w:type="spellEnd"/>
+            <w:r>
+              <w:rPr>
+                <w:rFonts w:eastAsia="MS Mincho" w:cs="Open Sans"/>
+                <w:sz w:val="18"/>
+                <w:szCs w:val="18"/>
+                <w:lang w:eastAsia="ja-JP"/>
+              </w:rPr>
+              <w:t xml:space="preserve"> Colombia, identificado con NIT 830.053.994-4. constituido mediante contrato de fiducia mercantil de fecha 6 de julio de 2022 y modificado integralmente el 20 de septiembre de 2022, y representado por Fiduciaria Scotiabank Colpatria S.A. (el “</w:t>
             </w:r>
             <w:r>
               <w:rPr>
@@ -14408,7 +15177,27 @@
                 <w:szCs w:val="18"/>
                 <w:lang w:eastAsia="ja-JP"/>
               </w:rPr>
-              <w:t>” y, conjuntamente con Finkargo Colombia, las “</w:t>
+              <w:t xml:space="preserve">” y, conjuntamente con </w:t>
+            </w:r>
+            <w:proofErr w:type="spellStart"/>
+            <w:r>
+              <w:rPr>
+                <w:rFonts w:eastAsia="MS Mincho" w:cs="Open Sans"/>
+                <w:sz w:val="18"/>
+                <w:szCs w:val="18"/>
+                <w:lang w:eastAsia="ja-JP"/>
+              </w:rPr>
+              <w:t>Finkargo</w:t>
+            </w:r>
+            <w:proofErr w:type="spellEnd"/>
+            <w:r>
+              <w:rPr>
+                <w:rFonts w:eastAsia="MS Mincho" w:cs="Open Sans"/>
+                <w:sz w:val="18"/>
+                <w:szCs w:val="18"/>
+                <w:lang w:eastAsia="ja-JP"/>
+              </w:rPr>
+              <w:t xml:space="preserve"> Colombia, las “</w:t>
             </w:r>
             <w:r>
               <w:rPr>
@@ -14798,21 +15587,38 @@
                 <w:szCs w:val="18"/>
                 <w:highlight w:val="lightGray"/>
               </w:rPr>
-              <w:t>valor en letras</w:t>
-            </w:r>
+              <w:t xml:space="preserve">valor en </w:t>
+            </w:r>
+            <w:proofErr w:type="gramStart"/>
             <w:r>
               <w:rPr>
                 <w:sz w:val="18"/>
                 <w:szCs w:val="18"/>
-              </w:rPr>
-              <w:t xml:space="preserve"> </w:t>
+                <w:highlight w:val="lightGray"/>
+              </w:rPr>
+              <w:t>letras</w:t>
             </w:r>
             <w:r>
               <w:rPr>
                 <w:sz w:val="18"/>
                 <w:szCs w:val="18"/>
               </w:rPr>
-              <w:t>] Dólares (USD[</w:t>
+              <w:t xml:space="preserve"> </w:t>
+            </w:r>
+            <w:r>
+              <w:rPr>
+                <w:sz w:val="18"/>
+                <w:szCs w:val="18"/>
+              </w:rPr>
+              <w:t>]</w:t>
+            </w:r>
+            <w:proofErr w:type="gramEnd"/>
+            <w:r>
+              <w:rPr>
+                <w:sz w:val="18"/>
+                <w:szCs w:val="18"/>
+              </w:rPr>
+              <w:t xml:space="preserve"> Dólares (USD[</w:t>
             </w:r>
             <w:r>
               <w:rPr>
@@ -14947,7 +15753,16 @@
                       <w:szCs w:val="18"/>
                       <w:highlight w:val="lightGray"/>
                     </w:rPr>
-                    <w:t>Nombre del representante legal</w:t>
+                    <w:t xml:space="preserve">Nombre del representante </w:t>
+                  </w:r>
+                  <w:proofErr w:type="gramStart"/>
+                  <w:r>
+                    <w:rPr>
+                      <w:sz w:val="18"/>
+                      <w:szCs w:val="18"/>
+                      <w:highlight w:val="lightGray"/>
+                    </w:rPr>
+                    <w:t>legal</w:t>
                   </w:r>
                   <w:r>
                     <w:rPr>
@@ -14963,6 +15778,7 @@
                     </w:rPr>
                     <w:t>]</w:t>
                   </w:r>
+                  <w:proofErr w:type="gramEnd"/>
                   <w:r>
                     <w:rPr>
                       <w:sz w:val="18"/>
@@ -15016,6 +15832,7 @@
                     </w:rPr>
                     <w:t xml:space="preserve"> </w:t>
                   </w:r>
+                  <w:proofErr w:type="gramStart"/>
                   <w:r>
                     <w:rPr>
                       <w:sz w:val="18"/>
@@ -15040,6 +15857,7 @@
                     </w:rPr>
                     <w:t>]</w:t>
                   </w:r>
+                  <w:proofErr w:type="gramEnd"/>
                   <w:r>
                     <w:rPr>
                       <w:sz w:val="18"/>
@@ -15116,7 +15934,17 @@
                       <w:szCs w:val="18"/>
                       <w:highlight w:val="lightGray"/>
                     </w:rPr>
-                    <w:t>Nombre del apoderado</w:t>
+                    <w:t xml:space="preserve">Nombre del </w:t>
+                  </w:r>
+                  <w:proofErr w:type="gramStart"/>
+                  <w:r>
+                    <w:rPr>
+                      <w:rFonts w:cs="Open Sans"/>
+                      <w:sz w:val="18"/>
+                      <w:szCs w:val="18"/>
+                      <w:highlight w:val="lightGray"/>
+                    </w:rPr>
+                    <w:t>apoderado</w:t>
                   </w:r>
                   <w:r>
                     <w:rPr>
@@ -15134,6 +15962,7 @@
                     </w:rPr>
                     <w:t>]</w:t>
                   </w:r>
+                  <w:proofErr w:type="gramEnd"/>
                   <w:r>
                     <w:rPr>
                       <w:rFonts w:cs="Open Sans"/>
@@ -15194,6 +16023,7 @@
                     </w:rPr>
                     <w:t xml:space="preserve"> </w:t>
                   </w:r>
+                  <w:proofErr w:type="gramStart"/>
                   <w:r>
                     <w:rPr>
                       <w:rFonts w:cs="Open Sans"/>
@@ -15221,6 +16051,7 @@
                     </w:rPr>
                     <w:t>]</w:t>
                   </w:r>
+                  <w:proofErr w:type="gramEnd"/>
                   <w:r>
                     <w:rPr>
                       <w:rFonts w:cs="Open Sans"/>
@@ -15255,8 +16086,8 @@
       </w:pPr>
     </w:p>
     <w:sectPr>
-      <w:headerReference w:type="default" r:id="rId24"/>
-      <w:footerReference w:type="default" r:id="rId25"/>
+      <w:headerReference w:type="default" r:id="rId23"/>
+      <w:footerReference w:type="default" r:id="rId24"/>
       <w:pgSz w:w="12240" w:h="15840" w:code="1"/>
       <w:pgMar w:top="1134" w:right="1134" w:bottom="1134" w:left="1134" w:header="709" w:footer="709" w:gutter="0"/>
       <w:pgNumType w:fmt="lowerRoman" w:start="1"/>

</xml_diff>

<commit_message>
feat: Update guarantee contract template with latest legal requirements
Updated the asset guarantee contract template (FK COL - GM - Activos.docx)
with the latest legal requirements and formatting changes. Preserved previous
version as backup for reference.

🤖 Generated with [Claude Code](https://claude.com/claude-code)

Co-Authored-By: Claude <noreply@anthropic.com>
</commit_message>
<xml_diff>
--- a/backend/templates/FK COL - GM - Activos.docx
+++ b/backend/templates/FK COL - GM - Activos.docx
@@ -1142,14 +1142,12 @@
       </w:r>
       <w:r>
         <w:rPr>
-          <w:color w:val="EE0000"/>
           <w:lang w:val="es-CO"/>
         </w:rPr>
         <w:t>Contrato Marco No: CO:[</w:t>
       </w:r>
       <w:r>
         <w:rPr>
-          <w:color w:val="EE0000"/>
           <w:highlight w:val="yellow"/>
           <w:lang w:val="es-CO"/>
         </w:rPr>
@@ -1157,7 +1155,6 @@
       </w:r>
       <w:r>
         <w:rPr>
-          <w:color w:val="EE0000"/>
           <w:lang w:val="es-CO"/>
         </w:rPr>
         <w:t xml:space="preserve">]:1:D:M </w:t>
@@ -12625,6 +12622,10 @@
     <w:p>
       <w:pPr>
         <w:pStyle w:val="Heading3"/>
+        <w:numPr>
+          <w:ilvl w:val="2"/>
+          <w:numId w:val="44"/>
+        </w:numPr>
       </w:pPr>
       <w:proofErr w:type="spellStart"/>
       <w:r>
@@ -13322,6 +13323,9 @@
               <w:t xml:space="preserve">E-mail: </w:t>
             </w:r>
             <w:r>
+              <w:rPr>
+                <w:lang w:val="es-MX"/>
+              </w:rPr>
               <w:fldChar w:fldCharType="begin"/>
             </w:r>
             <w:r>
@@ -13331,6 +13335,9 @@
               <w:instrText xml:space="preserve"> HYPERLINK "mailto:andres.gonzalez@finkargo.com" </w:instrText>
             </w:r>
             <w:r>
+              <w:rPr>
+                <w:lang w:val="es-MX"/>
+              </w:rPr>
               <w:fldChar w:fldCharType="separate"/>
             </w:r>
             <w:r>
@@ -14533,7 +14540,6 @@
         <w:br w:type="page"/>
       </w:r>
       <w:bookmarkStart w:id="124" w:name="_Ref129859864"/>
-      <w:commentRangeStart w:id="125"/>
       <w:r>
         <w:rPr>
           <w:u w:val="none"/>
@@ -14544,16 +14550,6 @@
       <w:r>
         <w:br/>
         <w:t>FORMATO DE NOTIFICACIÓN DE EVENTO DE INCUMPLIMIENTO</w:t>
-      </w:r>
-      <w:commentRangeEnd w:id="125"/>
-      <w:r>
-        <w:rPr>
-          <w:rStyle w:val="CommentReference"/>
-          <w:rFonts w:eastAsia="Calibri" w:cs="Calibri"/>
-          <w:caps w:val="0"/>
-          <w:u w:val="none"/>
-        </w:rPr>
-        <w:commentReference w:id="125"/>
       </w:r>
     </w:p>
     <w:tbl>
@@ -14727,7 +14723,7 @@
               </w:rPr>
               <w:br/>
             </w:r>
-            <w:bookmarkStart w:id="126" w:name="_Hlk129871335"/>
+            <w:bookmarkStart w:id="125" w:name="_Hlk129871335"/>
             <w:r>
               <w:rPr>
                 <w:b/>
@@ -14756,7 +14752,6 @@
               </w:rPr>
               <w:t xml:space="preserve">NOMBRE DEL </w:t>
             </w:r>
-            <w:commentRangeStart w:id="127"/>
             <w:proofErr w:type="gramStart"/>
             <w:r>
               <w:rPr>
@@ -14786,17 +14781,8 @@
               </w:rPr>
               <w:t>]</w:t>
             </w:r>
-            <w:bookmarkEnd w:id="126"/>
-            <w:commentRangeEnd w:id="127"/>
+            <w:bookmarkEnd w:id="125"/>
             <w:proofErr w:type="gramEnd"/>
-            <w:r>
-              <w:rPr>
-                <w:rStyle w:val="CommentReference"/>
-                <w:rFonts w:eastAsia="Calibri" w:cs="Calibri"/>
-                <w:lang w:val="es-MX"/>
-              </w:rPr>
-              <w:commentReference w:id="127"/>
-            </w:r>
             <w:r>
               <w:rPr>
                 <w:sz w:val="18"/>
@@ -15036,7 +15022,7 @@
               </w:rPr>
               <w:t>”) entre</w:t>
             </w:r>
-            <w:bookmarkStart w:id="128" w:name="_Hlk133445921"/>
+            <w:bookmarkStart w:id="126" w:name="_Hlk133445921"/>
             <w:r>
               <w:rPr>
                 <w:sz w:val="18"/>
@@ -15352,7 +15338,7 @@
               </w:rPr>
               <w:t>]</w:t>
             </w:r>
-            <w:bookmarkEnd w:id="128"/>
+            <w:bookmarkEnd w:id="126"/>
             <w:r>
               <w:rPr>
                 <w:sz w:val="18"/>
@@ -15697,7 +15683,7 @@
                       <w:lang w:val="es-CO"/>
                     </w:rPr>
                   </w:pPr>
-                  <w:bookmarkStart w:id="129" w:name="_Hlk133445974"/>
+                  <w:bookmarkStart w:id="127" w:name="_Hlk133445974"/>
                   <w:r>
                     <w:rPr>
                       <w:sz w:val="18"/>
@@ -16064,7 +16050,7 @@
                 </w:p>
               </w:tc>
             </w:tr>
-            <w:bookmarkEnd w:id="129"/>
+            <w:bookmarkEnd w:id="127"/>
           </w:tbl>
           <w:p>
             <w:pPr>
@@ -16086,8 +16072,8 @@
       </w:pPr>
     </w:p>
     <w:sectPr>
-      <w:headerReference w:type="default" r:id="rId23"/>
-      <w:footerReference w:type="default" r:id="rId24"/>
+      <w:headerReference w:type="default" r:id="rId19"/>
+      <w:footerReference w:type="default" r:id="rId20"/>
       <w:pgSz w:w="12240" w:h="15840" w:code="1"/>
       <w:pgMar w:top="1134" w:right="1134" w:bottom="1134" w:left="1134" w:header="709" w:footer="709" w:gutter="0"/>
       <w:pgNumType w:fmt="lowerRoman" w:start="1"/>
@@ -16095,70 +16081,6 @@
     </w:sectPr>
   </w:body>
 </w:document>
-</file>
-
-<file path=word/comments.xml><?xml version="1.0" encoding="utf-8"?>
-<w:comments xmlns:wpc="http://schemas.microsoft.com/office/word/2010/wordprocessingCanvas" xmlns:cx="http://schemas.microsoft.com/office/drawing/2014/chartex" xmlns:cx1="http://schemas.microsoft.com/office/drawing/2015/9/8/chartex" xmlns:cx2="http://schemas.microsoft.com/office/drawing/2015/10/21/chartex" xmlns:cx3="http://schemas.microsoft.com/office/drawing/2016/5/9/chartex" xmlns:cx4="http://schemas.microsoft.com/office/drawing/2016/5/10/chartex" xmlns:cx5="http://schemas.microsoft.com/office/drawing/2016/5/11/chartex" xmlns:cx6="http://schemas.microsoft.com/office/drawing/2016/5/12/chartex" xmlns:cx7="http://schemas.microsoft.com/office/drawing/2016/5/13/chartex" xmlns:cx8="http://schemas.microsoft.com/office/drawing/2016/5/14/chartex" xmlns:mc="http://schemas.openxmlformats.org/markup-compatibility/2006" xmlns:aink="http://schemas.microsoft.com/office/drawing/2016/ink" xmlns:am3d="http://schemas.microsoft.com/office/drawing/2017/model3d" xmlns:o="urn:schemas-microsoft-com:office:office" xmlns:r="http://schemas.openxmlformats.org/officeDocument/2006/relationships" xmlns:m="http://schemas.openxmlformats.org/officeDocument/2006/math" xmlns:v="urn:schemas-microsoft-com:vml" xmlns:wp14="http://schemas.microsoft.com/office/word/2010/wordprocessingDrawing" xmlns:wp="http://schemas.openxmlformats.org/drawingml/2006/wordprocessingDrawing" xmlns:w10="urn:schemas-microsoft-com:office:word" xmlns:w="http://schemas.openxmlformats.org/wordprocessingml/2006/main" xmlns:w14="http://schemas.microsoft.com/office/word/2010/wordml" xmlns:w15="http://schemas.microsoft.com/office/word/2012/wordml" xmlns:w16cex="http://schemas.microsoft.com/office/word/2018/wordml/cex" xmlns:w16cid="http://schemas.microsoft.com/office/word/2016/wordml/cid" xmlns:w16="http://schemas.microsoft.com/office/word/2018/wordml" xmlns:w16se="http://schemas.microsoft.com/office/word/2015/wordml/symex" xmlns:wpg="http://schemas.microsoft.com/office/word/2010/wordprocessingGroup" xmlns:wpi="http://schemas.microsoft.com/office/word/2010/wordprocessingInk" xmlns:wne="http://schemas.microsoft.com/office/word/2006/wordml" xmlns:wps="http://schemas.microsoft.com/office/word/2010/wordprocessingShape" mc:Ignorable="w14 w15 w16se w16cid w16 w16cex wp14">
-  <w:comment w:id="125" w:author="ANA SOFIA TOBON TAMAYO" w:date="2025-10-07T14:34:00Z" w:initials="AT">
-    <w:p>
-      <w:pPr>
-        <w:jc w:val="left"/>
-      </w:pPr>
-      <w:r>
-        <w:rPr>
-          <w:rStyle w:val="CommentReference"/>
-        </w:rPr>
-        <w:annotationRef/>
-      </w:r>
-      <w:r>
-        <w:rPr>
-          <w:szCs w:val="20"/>
-        </w:rPr>
-        <w:t>Dani dejemos todo este formato sin llenar, o sea así tal cual que quede sin necesidad de llenar los campos</w:t>
-      </w:r>
-    </w:p>
-  </w:comment>
-  <w:comment w:id="127" w:author="ANA SOFIA TOBON TAMAYO" w:date="2025-10-07T13:57:00Z" w:initials="AT">
-    <w:p>
-      <w:pPr>
-        <w:jc w:val="left"/>
-      </w:pPr>
-      <w:r>
-        <w:rPr>
-          <w:rStyle w:val="CommentReference"/>
-        </w:rPr>
-        <w:annotationRef/>
-      </w:r>
-      <w:r>
-        <w:rPr>
-          <w:szCs w:val="20"/>
-        </w:rPr>
-        <w:t>Lo que está highlited en gris no debe llenarse (en este caso, por ejemplo es un formato anexo al contrato entonces se llena cuando sea necesario en el momento en que se vaya a usar)</w:t>
-      </w:r>
-    </w:p>
-  </w:comment>
-</w:comments>
-</file>
-
-<file path=word/commentsExtended.xml><?xml version="1.0" encoding="utf-8"?>
-<w15:commentsEx xmlns:wpc="http://schemas.microsoft.com/office/word/2010/wordprocessingCanvas" xmlns:cx="http://schemas.microsoft.com/office/drawing/2014/chartex" xmlns:cx1="http://schemas.microsoft.com/office/drawing/2015/9/8/chartex" xmlns:cx2="http://schemas.microsoft.com/office/drawing/2015/10/21/chartex" xmlns:cx3="http://schemas.microsoft.com/office/drawing/2016/5/9/chartex" xmlns:cx4="http://schemas.microsoft.com/office/drawing/2016/5/10/chartex" xmlns:cx5="http://schemas.microsoft.com/office/drawing/2016/5/11/chartex" xmlns:cx6="http://schemas.microsoft.com/office/drawing/2016/5/12/chartex" xmlns:cx7="http://schemas.microsoft.com/office/drawing/2016/5/13/chartex" xmlns:cx8="http://schemas.microsoft.com/office/drawing/2016/5/14/chartex" xmlns:mc="http://schemas.openxmlformats.org/markup-compatibility/2006" xmlns:aink="http://schemas.microsoft.com/office/drawing/2016/ink" xmlns:am3d="http://schemas.microsoft.com/office/drawing/2017/model3d" xmlns:o="urn:schemas-microsoft-com:office:office" xmlns:r="http://schemas.openxmlformats.org/officeDocument/2006/relationships" xmlns:m="http://schemas.openxmlformats.org/officeDocument/2006/math" xmlns:v="urn:schemas-microsoft-com:vml" xmlns:wp14="http://schemas.microsoft.com/office/word/2010/wordprocessingDrawing" xmlns:wp="http://schemas.openxmlformats.org/drawingml/2006/wordprocessingDrawing" xmlns:w10="urn:schemas-microsoft-com:office:word" xmlns:w="http://schemas.openxmlformats.org/wordprocessingml/2006/main" xmlns:w14="http://schemas.microsoft.com/office/word/2010/wordml" xmlns:w15="http://schemas.microsoft.com/office/word/2012/wordml" xmlns:w16cex="http://schemas.microsoft.com/office/word/2018/wordml/cex" xmlns:w16cid="http://schemas.microsoft.com/office/word/2016/wordml/cid" xmlns:w16="http://schemas.microsoft.com/office/word/2018/wordml" xmlns:w16se="http://schemas.microsoft.com/office/word/2015/wordml/symex" xmlns:wpg="http://schemas.microsoft.com/office/word/2010/wordprocessingGroup" xmlns:wpi="http://schemas.microsoft.com/office/word/2010/wordprocessingInk" xmlns:wne="http://schemas.microsoft.com/office/word/2006/wordml" xmlns:wps="http://schemas.microsoft.com/office/word/2010/wordprocessingShape" mc:Ignorable="w14 w15 w16se w16cid w16 w16cex wp14">
-  <w15:commentEx w15:paraId="6CF6E2B7" w15:done="0"/>
-  <w15:commentEx w15:paraId="75AF8833" w15:done="0"/>
-</w15:commentsEx>
-</file>
-
-<file path=word/commentsExtensible.xml><?xml version="1.0" encoding="utf-8"?>
-<w16cex:commentsExtensible xmlns:wpc="http://schemas.microsoft.com/office/word/2010/wordprocessingCanvas" xmlns:cx="http://schemas.microsoft.com/office/drawing/2014/chartex" xmlns:cx1="http://schemas.microsoft.com/office/drawing/2015/9/8/chartex" xmlns:cx2="http://schemas.microsoft.com/office/drawing/2015/10/21/chartex" xmlns:cx3="http://schemas.microsoft.com/office/drawing/2016/5/9/chartex" xmlns:cx4="http://schemas.microsoft.com/office/drawing/2016/5/10/chartex" xmlns:cx5="http://schemas.microsoft.com/office/drawing/2016/5/11/chartex" xmlns:cx6="http://schemas.microsoft.com/office/drawing/2016/5/12/chartex" xmlns:cx7="http://schemas.microsoft.com/office/drawing/2016/5/13/chartex" xmlns:cx8="http://schemas.microsoft.com/office/drawing/2016/5/14/chartex" xmlns:mc="http://schemas.openxmlformats.org/markup-compatibility/2006" xmlns:aink="http://schemas.microsoft.com/office/drawing/2016/ink" xmlns:am3d="http://schemas.microsoft.com/office/drawing/2017/model3d" xmlns:o="urn:schemas-microsoft-com:office:office" xmlns:r="http://schemas.openxmlformats.org/officeDocument/2006/relationships" xmlns:m="http://schemas.openxmlformats.org/officeDocument/2006/math" xmlns:v="urn:schemas-microsoft-com:vml" xmlns:wp14="http://schemas.microsoft.com/office/word/2010/wordprocessingDrawing" xmlns:wp="http://schemas.openxmlformats.org/drawingml/2006/wordprocessingDrawing" xmlns:w10="urn:schemas-microsoft-com:office:word" xmlns:w="http://schemas.openxmlformats.org/wordprocessingml/2006/main" xmlns:w14="http://schemas.microsoft.com/office/word/2010/wordml" xmlns:w15="http://schemas.microsoft.com/office/word/2012/wordml" xmlns:w16cex="http://schemas.microsoft.com/office/word/2018/wordml/cex" xmlns:w16cid="http://schemas.microsoft.com/office/word/2016/wordml/cid" xmlns:w16="http://schemas.microsoft.com/office/word/2018/wordml" xmlns:w16se="http://schemas.microsoft.com/office/word/2015/wordml/symex" xmlns:wpg="http://schemas.microsoft.com/office/word/2010/wordprocessingGroup" xmlns:wpi="http://schemas.microsoft.com/office/word/2010/wordprocessingInk" xmlns:wne="http://schemas.microsoft.com/office/word/2006/wordml" xmlns:wps="http://schemas.microsoft.com/office/word/2010/wordprocessingShape" mc:Ignorable="w14 w15 w16se w16cid w16 w16cex wp14">
-  <w16cex:commentExtensible w16cex:durableId="533FD8BB" w16cex:dateUtc="2025-10-07T19:34:00Z"/>
-  <w16cex:commentExtensible w16cex:durableId="2ADC3CE9" w16cex:dateUtc="2025-10-07T18:57:00Z"/>
-</w16cex:commentsExtensible>
-</file>
-
-<file path=word/commentsIds.xml><?xml version="1.0" encoding="utf-8"?>
-<w16cid:commentsIds xmlns:wpc="http://schemas.microsoft.com/office/word/2010/wordprocessingCanvas" xmlns:cx="http://schemas.microsoft.com/office/drawing/2014/chartex" xmlns:cx1="http://schemas.microsoft.com/office/drawing/2015/9/8/chartex" xmlns:cx2="http://schemas.microsoft.com/office/drawing/2015/10/21/chartex" xmlns:cx3="http://schemas.microsoft.com/office/drawing/2016/5/9/chartex" xmlns:cx4="http://schemas.microsoft.com/office/drawing/2016/5/10/chartex" xmlns:cx5="http://schemas.microsoft.com/office/drawing/2016/5/11/chartex" xmlns:cx6="http://schemas.microsoft.com/office/drawing/2016/5/12/chartex" xmlns:cx7="http://schemas.microsoft.com/office/drawing/2016/5/13/chartex" xmlns:cx8="http://schemas.microsoft.com/office/drawing/2016/5/14/chartex" xmlns:mc="http://schemas.openxmlformats.org/markup-compatibility/2006" xmlns:aink="http://schemas.microsoft.com/office/drawing/2016/ink" xmlns:am3d="http://schemas.microsoft.com/office/drawing/2017/model3d" xmlns:o="urn:schemas-microsoft-com:office:office" xmlns:r="http://schemas.openxmlformats.org/officeDocument/2006/relationships" xmlns:m="http://schemas.openxmlformats.org/officeDocument/2006/math" xmlns:v="urn:schemas-microsoft-com:vml" xmlns:wp14="http://schemas.microsoft.com/office/word/2010/wordprocessingDrawing" xmlns:wp="http://schemas.openxmlformats.org/drawingml/2006/wordprocessingDrawing" xmlns:w10="urn:schemas-microsoft-com:office:word" xmlns:w="http://schemas.openxmlformats.org/wordprocessingml/2006/main" xmlns:w14="http://schemas.microsoft.com/office/word/2010/wordml" xmlns:w15="http://schemas.microsoft.com/office/word/2012/wordml" xmlns:w16cex="http://schemas.microsoft.com/office/word/2018/wordml/cex" xmlns:w16cid="http://schemas.microsoft.com/office/word/2016/wordml/cid" xmlns:w16="http://schemas.microsoft.com/office/word/2018/wordml" xmlns:w16se="http://schemas.microsoft.com/office/word/2015/wordml/symex" xmlns:wpg="http://schemas.microsoft.com/office/word/2010/wordprocessingGroup" xmlns:wpi="http://schemas.microsoft.com/office/word/2010/wordprocessingInk" xmlns:wne="http://schemas.microsoft.com/office/word/2006/wordml" xmlns:wps="http://schemas.microsoft.com/office/word/2010/wordprocessingShape" mc:Ignorable="w14 w15 w16se w16cid w16 w16cex wp14">
-  <w16cid:commentId w16cid:paraId="6CF6E2B7" w16cid:durableId="533FD8BB"/>
-  <w16cid:commentId w16cid:paraId="75AF8833" w16cid:durableId="2ADC3CE9"/>
-</w16cid:commentsIds>
 </file>
 
 <file path=word/endnotes.xml><?xml version="1.0" encoding="utf-8"?>
@@ -16656,7 +16578,7 @@
   <w:abstractNum w:abstractNumId="2" w15:restartNumberingAfterBreak="0">
     <w:nsid w:val="2217152C"/>
     <w:multiLevelType w:val="multilevel"/>
-    <w:tmpl w:val="EB084844"/>
+    <w:tmpl w:val="22CC5ABE"/>
     <w:lvl w:ilvl="0">
       <w:start w:val="1"/>
       <w:numFmt w:val="upperRoman"/>
@@ -18389,16 +18311,38 @@
       <w:startOverride w:val="1"/>
     </w:lvlOverride>
   </w:num>
+  <w:num w:numId="44">
+    <w:abstractNumId w:val="2"/>
+    <w:lvlOverride w:ilvl="0">
+      <w:startOverride w:val="9"/>
+    </w:lvlOverride>
+    <w:lvlOverride w:ilvl="1">
+      <w:startOverride w:val="1"/>
+    </w:lvlOverride>
+    <w:lvlOverride w:ilvl="2">
+      <w:startOverride w:val="1"/>
+    </w:lvlOverride>
+    <w:lvlOverride w:ilvl="3">
+      <w:startOverride w:val="1"/>
+    </w:lvlOverride>
+    <w:lvlOverride w:ilvl="4">
+      <w:startOverride w:val="1"/>
+    </w:lvlOverride>
+    <w:lvlOverride w:ilvl="5">
+      <w:startOverride w:val="1"/>
+    </w:lvlOverride>
+    <w:lvlOverride w:ilvl="6">
+      <w:startOverride w:val="1"/>
+    </w:lvlOverride>
+    <w:lvlOverride w:ilvl="7">
+      <w:startOverride w:val="1"/>
+    </w:lvlOverride>
+    <w:lvlOverride w:ilvl="8">
+      <w:startOverride w:val="1"/>
+    </w:lvlOverride>
+  </w:num>
   <w:numIdMacAtCleanup w:val="8"/>
 </w:numbering>
-</file>
-
-<file path=word/people.xml><?xml version="1.0" encoding="utf-8"?>
-<w15:people xmlns:wpc="http://schemas.microsoft.com/office/word/2010/wordprocessingCanvas" xmlns:cx="http://schemas.microsoft.com/office/drawing/2014/chartex" xmlns:cx1="http://schemas.microsoft.com/office/drawing/2015/9/8/chartex" xmlns:cx2="http://schemas.microsoft.com/office/drawing/2015/10/21/chartex" xmlns:cx3="http://schemas.microsoft.com/office/drawing/2016/5/9/chartex" xmlns:cx4="http://schemas.microsoft.com/office/drawing/2016/5/10/chartex" xmlns:cx5="http://schemas.microsoft.com/office/drawing/2016/5/11/chartex" xmlns:cx6="http://schemas.microsoft.com/office/drawing/2016/5/12/chartex" xmlns:cx7="http://schemas.microsoft.com/office/drawing/2016/5/13/chartex" xmlns:cx8="http://schemas.microsoft.com/office/drawing/2016/5/14/chartex" xmlns:mc="http://schemas.openxmlformats.org/markup-compatibility/2006" xmlns:aink="http://schemas.microsoft.com/office/drawing/2016/ink" xmlns:am3d="http://schemas.microsoft.com/office/drawing/2017/model3d" xmlns:o="urn:schemas-microsoft-com:office:office" xmlns:r="http://schemas.openxmlformats.org/officeDocument/2006/relationships" xmlns:m="http://schemas.openxmlformats.org/officeDocument/2006/math" xmlns:v="urn:schemas-microsoft-com:vml" xmlns:wp14="http://schemas.microsoft.com/office/word/2010/wordprocessingDrawing" xmlns:wp="http://schemas.openxmlformats.org/drawingml/2006/wordprocessingDrawing" xmlns:w10="urn:schemas-microsoft-com:office:word" xmlns:w="http://schemas.openxmlformats.org/wordprocessingml/2006/main" xmlns:w14="http://schemas.microsoft.com/office/word/2010/wordml" xmlns:w15="http://schemas.microsoft.com/office/word/2012/wordml" xmlns:w16cex="http://schemas.microsoft.com/office/word/2018/wordml/cex" xmlns:w16cid="http://schemas.microsoft.com/office/word/2016/wordml/cid" xmlns:w16="http://schemas.microsoft.com/office/word/2018/wordml" xmlns:w16se="http://schemas.microsoft.com/office/word/2015/wordml/symex" xmlns:wpg="http://schemas.microsoft.com/office/word/2010/wordprocessingGroup" xmlns:wpi="http://schemas.microsoft.com/office/word/2010/wordprocessingInk" xmlns:wne="http://schemas.microsoft.com/office/word/2006/wordml" xmlns:wps="http://schemas.microsoft.com/office/word/2010/wordprocessingShape" mc:Ignorable="w14 w15 w16se w16cid w16 w16cex wp14">
-  <w15:person w15:author="ANA SOFIA TOBON TAMAYO">
-    <w15:presenceInfo w15:providerId="AD" w15:userId="S::astobon@javeriana.edu.co::4ec40ea8-78e0-49a7-bd6f-6369c8897f47"/>
-  </w15:person>
-</w15:people>
 </file>
 
 <file path=word/styles.xml><?xml version="1.0" encoding="utf-8"?>

</xml_diff>

<commit_message>
feat: Update guarantee contract Word template
Updated FK COL - GM - Activos.docx template with latest changes.

🤖 Generated with [Claude Code](https://claude.com/claude-code)

Co-Authored-By: Claude <noreply@anthropic.com>
</commit_message>
<xml_diff>
--- a/backend/templates/FK COL - GM - Activos.docx
+++ b/backend/templates/FK COL - GM - Activos.docx
@@ -10902,7 +10902,19 @@
         <w:t xml:space="preserve">de conformidad con las reglas y procedimientos especiales establecidos en este Contrato y, en lo no establecido por éste, de conformidad con lo previsto en el Capítulo III </w:t>
       </w:r>
       <w:r>
-        <w:t xml:space="preserve">[sic] </w:t>
+        <w:t>[</w:t>
+      </w:r>
+      <w:r>
+        <w:t xml:space="preserve"> </w:t>
+      </w:r>
+      <w:r>
+        <w:t>sic</w:t>
+      </w:r>
+      <w:r>
+        <w:t xml:space="preserve"> </w:t>
+      </w:r>
+      <w:r>
+        <w:t xml:space="preserve">] </w:t>
       </w:r>
       <w:r>
         <w:t xml:space="preserve">del Título VI de la Ley de Garantías Mobiliarias (ejecución especial de la garantía) y el Decreto 1074 de 2015, procedimiento que se llevará a cabo ante el </w:t>
@@ -19900,28 +19912,28 @@
 </file>
 
 <file path=customXml/item1.xml><?xml version="1.0" encoding="utf-8"?>
+<b:Sources xmlns:b="http://schemas.openxmlformats.org/officeDocument/2006/bibliography" xmlns="http://schemas.openxmlformats.org/officeDocument/2006/bibliography" SelectedStyle="\APASixthEditionOfficeOnline.xsl" StyleName="APA" Version="6"/>
+</file>
+
+<file path=customXml/item2.xml><?xml version="1.0" encoding="utf-8"?>
 <go:gDocsCustomXmlDataStorage xmlns:go="http://customooxmlschemas.google.com/" xmlns:r="http://schemas.openxmlformats.org/officeDocument/2006/relationships">
   <go:docsCustomData xmlns:go="http://customooxmlschemas.google.com/" roundtripDataSignature="AMtx7mhzdpfn1finIqKXU+1UPIfU21OW1Q==">AMUW2mVvpZPnv5te96KCzqdpwIhLXEqqDf1Jm/Jsn5xfICjpf7+cLx66Pg3Z6OyclqamRuaI6NzxVfznks8qzXgq6Shzb3AvxFhRa3ikUeQpf55ToVd72oiAa63NjuOKhuLrTUBAwX7TxT6/jKPCkAwx81Cl/siheji2glXXaNE6LOUNE4D+R7OYEQfFjaKo2CzTlnGc1WEdiQoLVoiQnpq1QlduKazjn1jsN2tZpEvoXRVNcjxJejMHEr/s7YsU4SRSZf/CGJlMizcgpazttZ88EnKSbtK2kaxsLvT+ygQ6Nt698VUDGYk4KHB27iDAg6aqb4m7SIwK</go:docsCustomData>
 </go:gDocsCustomXmlDataStorage>
 </file>
 
-<file path=customXml/item2.xml><?xml version="1.0" encoding="utf-8"?>
-<b:Sources xmlns:b="http://schemas.openxmlformats.org/officeDocument/2006/bibliography" xmlns="http://schemas.openxmlformats.org/officeDocument/2006/bibliography" SelectedStyle="\APASixthEditionOfficeOnline.xsl" StyleName="APA" Version="6"/>
+<file path=customXml/itemProps1.xml><?xml version="1.0" encoding="utf-8"?>
+<ds:datastoreItem xmlns:ds="http://schemas.openxmlformats.org/officeDocument/2006/customXml" ds:itemID="{373DA788-535C-4842-9536-B8D15A43118A}">
+  <ds:schemaRefs>
+    <ds:schemaRef ds:uri="http://schemas.openxmlformats.org/officeDocument/2006/bibliography"/>
+  </ds:schemaRefs>
+</ds:datastoreItem>
 </file>
 
-<file path=customXml/itemProps1.xml><?xml version="1.0" encoding="utf-8"?>
+<file path=customXml/itemProps2.xml><?xml version="1.0" encoding="utf-8"?>
 <ds:datastoreItem xmlns:ds="http://schemas.openxmlformats.org/officeDocument/2006/customXml" ds:itemID="{11111111-1234-1234-1234-123412341234}">
   <ds:schemaRefs>
     <ds:schemaRef ds:uri="http://customooxmlschemas.google.com/"/>
     <ds:schemaRef ds:uri="http://schemas.openxmlformats.org/officeDocument/2006/relationships"/>
   </ds:schemaRefs>
 </ds:datastoreItem>
-</file>
-
-<file path=customXml/itemProps2.xml><?xml version="1.0" encoding="utf-8"?>
-<ds:datastoreItem xmlns:ds="http://schemas.openxmlformats.org/officeDocument/2006/customXml" ds:itemID="{373DA788-535C-4842-9536-B8D15A43118A}">
-  <ds:schemaRefs>
-    <ds:schemaRef ds:uri="http://schemas.openxmlformats.org/officeDocument/2006/bibliography"/>
-  </ds:schemaRefs>
-</ds:datastoreItem>
 </file>
</xml_diff>